<commit_message>
Adding LAB 11 Flutter
</commit_message>
<xml_diff>
--- a/LAB 11/lab 11.docx
+++ b/LAB 11/lab 11.docx
@@ -1,6 +1,6 @@
 
 <file path=word/document.xml><?xml version="1.0" encoding="utf-8"?>
-<w:document xmlns:wpc="http://schemas.microsoft.com/office/word/2010/wordprocessingCanvas" xmlns:cx="http://schemas.microsoft.com/office/drawing/2014/chartex" xmlns:cx1="http://schemas.microsoft.com/office/drawing/2015/9/8/chartex" xmlns:cx2="http://schemas.microsoft.com/office/drawing/2015/10/21/chartex" xmlns:cx3="http://schemas.microsoft.com/office/drawing/2016/5/9/chartex" xmlns:cx4="http://schemas.microsoft.com/office/drawing/2016/5/10/chartex" xmlns:cx5="http://schemas.microsoft.com/office/drawing/2016/5/11/chartex" xmlns:cx6="http://schemas.microsoft.com/office/drawing/2016/5/12/chartex" xmlns:cx7="http://schemas.microsoft.com/office/drawing/2016/5/13/chartex" xmlns:cx8="http://schemas.microsoft.com/office/drawing/2016/5/14/chartex" xmlns:mc="http://schemas.openxmlformats.org/markup-compatibility/2006" xmlns:aink="http://schemas.microsoft.com/office/drawing/2016/ink" xmlns:am3d="http://schemas.microsoft.com/office/drawing/2017/model3d" xmlns:o="urn:schemas-microsoft-com:office:office" xmlns:oel="http://schemas.microsoft.com/office/2019/extlst" xmlns:r="http://schemas.openxmlformats.org/officeDocument/2006/relationships" xmlns:m="http://schemas.openxmlformats.org/officeDocument/2006/math" xmlns:v="urn:schemas-microsoft-com:vml" xmlns:wp14="http://schemas.microsoft.com/office/word/2010/wordprocessingDrawing" xmlns:wp="http://schemas.openxmlformats.org/drawingml/2006/wordprocessingDrawing" xmlns:w10="urn:schemas-microsoft-com:office:word" xmlns:w="http://schemas.openxmlformats.org/wordprocessingml/2006/main" xmlns:w14="http://schemas.microsoft.com/office/word/2010/wordml" xmlns:w15="http://schemas.microsoft.com/office/word/2012/wordml" xmlns:w16cex="http://schemas.microsoft.com/office/word/2018/wordml/cex" xmlns:w16cid="http://schemas.microsoft.com/office/word/2016/wordml/cid" xmlns:w16="http://schemas.microsoft.com/office/word/2018/wordml" xmlns:w16du="http://schemas.microsoft.com/office/word/2023/wordml/word16du" xmlns:w16sdtdh="http://schemas.microsoft.com/office/word/2020/wordml/sdtdatahash" xmlns:w16sdtfl="http://schemas.microsoft.com/office/word/2024/wordml/sdtformatlock" xmlns:w16se="http://schemas.microsoft.com/office/word/2015/wordml/symex" xmlns:wpg="http://schemas.microsoft.com/office/word/2010/wordprocessingGroup" xmlns:wpi="http://schemas.microsoft.com/office/word/2010/wordprocessingInk" xmlns:wne="http://schemas.microsoft.com/office/word/2006/wordml" xmlns:wps="http://schemas.microsoft.com/office/word/2010/wordprocessingShape" mc:Ignorable="w14 w15 w16se w16cid w16 w16cex w16sdtdh w16sdtfl w16du wp14">
+<w:document xmlns:wpc="http://schemas.microsoft.com/office/word/2010/wordprocessingCanvas" xmlns:cx="http://schemas.microsoft.com/office/drawing/2014/chartex" xmlns:cx1="http://schemas.microsoft.com/office/drawing/2015/9/8/chartex" xmlns:cx2="http://schemas.microsoft.com/office/drawing/2015/10/21/chartex" xmlns:cx3="http://schemas.microsoft.com/office/drawing/2016/5/9/chartex" xmlns:cx4="http://schemas.microsoft.com/office/drawing/2016/5/10/chartex" xmlns:cx5="http://schemas.microsoft.com/office/drawing/2016/5/11/chartex" xmlns:cx6="http://schemas.microsoft.com/office/drawing/2016/5/12/chartex" xmlns:cx7="http://schemas.microsoft.com/office/drawing/2016/5/13/chartex" xmlns:cx8="http://schemas.microsoft.com/office/drawing/2016/5/14/chartex" xmlns:mc="http://schemas.openxmlformats.org/markup-compatibility/2006" xmlns:aink="http://schemas.microsoft.com/office/drawing/2016/ink" xmlns:am3d="http://schemas.microsoft.com/office/drawing/2017/model3d" xmlns:o="urn:schemas-microsoft-com:office:office" xmlns:r="http://schemas.openxmlformats.org/officeDocument/2006/relationships" xmlns:m="http://schemas.openxmlformats.org/officeDocument/2006/math" xmlns:v="urn:schemas-microsoft-com:vml" xmlns:wp14="http://schemas.microsoft.com/office/word/2010/wordprocessingDrawing" xmlns:wp="http://schemas.openxmlformats.org/drawingml/2006/wordprocessingDrawing" xmlns:w10="urn:schemas-microsoft-com:office:word" xmlns:w="http://schemas.openxmlformats.org/wordprocessingml/2006/main" xmlns:w14="http://schemas.microsoft.com/office/word/2010/wordml" xmlns:w15="http://schemas.microsoft.com/office/word/2012/wordml" xmlns:w16cid="http://schemas.microsoft.com/office/word/2016/wordml/cid" xmlns:w16se="http://schemas.microsoft.com/office/word/2015/wordml/symex" xmlns:wpg="http://schemas.microsoft.com/office/word/2010/wordprocessingGroup" xmlns:wpi="http://schemas.microsoft.com/office/word/2010/wordprocessingInk" xmlns:wne="http://schemas.microsoft.com/office/word/2006/wordml" xmlns:wps="http://schemas.microsoft.com/office/word/2010/wordprocessingShape" mc:Ignorable="w14 w15 w16se w16cid wp14">
   <w:body>
     <w:p>
       <w:pPr>
@@ -466,7 +466,7 @@
           </mc:Choice>
           <mc:Fallback>
             <w:pict>
-              <v:shape w14:anchorId="01161A12" id="Graphic 6" o:spid="_x0000_s1026" style="position:absolute;margin-left:240.05pt;margin-top:15.7pt;width:114pt;height:.1pt;z-index:-251662336;visibility:visible;mso-wrap-style:square;mso-wrap-distance-left:0;mso-wrap-distance-top:0;mso-wrap-distance-right:0;mso-wrap-distance-bottom:0;mso-position-horizontal:absolute;mso-position-horizontal-relative:page;mso-position-vertical:absolute;mso-position-vertical-relative:text;v-text-anchor:top" coordsize="1447800,1270" o:gfxdata="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" path="m,l1447800,e" filled="f" strokeweight=".26669mm">
+              <v:shape w14:anchorId="7C3DD17E" id="Graphic 6" o:spid="_x0000_s1026" style="position:absolute;margin-left:240.05pt;margin-top:15.7pt;width:114pt;height:.1pt;z-index:-251662336;visibility:visible;mso-wrap-style:square;mso-wrap-distance-left:0;mso-wrap-distance-top:0;mso-wrap-distance-right:0;mso-wrap-distance-bottom:0;mso-position-horizontal:absolute;mso-position-horizontal-relative:page;mso-position-vertical:absolute;mso-position-vertical-relative:text;v-text-anchor:top" coordsize="1447800,1270" o:gfxdata="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" path="m,l1447800,e" filled="f" strokeweight=".26669mm">
                 <v:path arrowok="t"/>
                 <w10:wrap type="topAndBottom" anchorx="page"/>
               </v:shape>
@@ -474,6 +474,15 @@
           </mc:Fallback>
         </mc:AlternateContent>
       </w:r>
+      <w:r>
+        <w:rPr>
+          <w:rFonts w:ascii="Times New Roman" w:eastAsia="Times New Roman" w:hAnsi="Times New Roman" w:cs="Times New Roman"/>
+          <w:b/>
+          <w:sz w:val="20"/>
+          <w:szCs w:val="24"/>
+        </w:rPr>
+        <w:t xml:space="preserve">                                                                                                    Miss Esha</w:t>
+      </w:r>
     </w:p>
     <w:p>
       <w:pPr>
@@ -531,6 +540,14 @@
           <w:rFonts w:ascii="Times New Roman" w:eastAsia="Times New Roman" w:hAnsi="Times New Roman" w:cs="Times New Roman"/>
           <w:b/>
           <w:sz w:val="24"/>
+        </w:rPr>
+        <w:t>_Haris_Ali</w:t>
+      </w:r>
+      <w:r>
+        <w:rPr>
+          <w:rFonts w:ascii="Times New Roman" w:eastAsia="Times New Roman" w:hAnsi="Times New Roman" w:cs="Times New Roman"/>
+          <w:b/>
+          <w:sz w:val="24"/>
           <w:u w:val="single"/>
         </w:rPr>
         <w:tab/>
@@ -572,6 +589,14 @@
           <w:rFonts w:ascii="Times New Roman" w:eastAsia="Times New Roman" w:hAnsi="Times New Roman" w:cs="Times New Roman"/>
           <w:b/>
           <w:sz w:val="24"/>
+        </w:rPr>
+        <w:t>______057</w:t>
+      </w:r>
+      <w:r>
+        <w:rPr>
+          <w:rFonts w:ascii="Times New Roman" w:eastAsia="Times New Roman" w:hAnsi="Times New Roman" w:cs="Times New Roman"/>
+          <w:b/>
+          <w:sz w:val="24"/>
           <w:u w:val="single"/>
         </w:rPr>
         <w:tab/>
@@ -613,6 +638,14 @@
           <w:rFonts w:ascii="Times New Roman" w:eastAsia="Times New Roman" w:hAnsi="Times New Roman" w:cs="Times New Roman"/>
           <w:b/>
           <w:sz w:val="24"/>
+        </w:rPr>
+        <w:t>_____A</w:t>
+      </w:r>
+      <w:r>
+        <w:rPr>
+          <w:rFonts w:ascii="Times New Roman" w:eastAsia="Times New Roman" w:hAnsi="Times New Roman" w:cs="Times New Roman"/>
+          <w:b/>
+          <w:sz w:val="24"/>
           <w:u w:val="single"/>
         </w:rPr>
         <w:tab/>
@@ -648,6 +681,14 @@
           <w:sz w:val="24"/>
         </w:rPr>
         <w:t xml:space="preserve">Semester: </w:t>
+      </w:r>
+      <w:r>
+        <w:rPr>
+          <w:rFonts w:ascii="Times New Roman" w:eastAsia="Times New Roman" w:hAnsi="Times New Roman" w:cs="Times New Roman"/>
+          <w:b/>
+          <w:sz w:val="24"/>
+        </w:rPr>
+        <w:t>_____6</w:t>
       </w:r>
       <w:r>
         <w:rPr>
@@ -1103,6 +1144,14 @@
           <w:rFonts w:ascii="Times New Roman" w:eastAsia="Times New Roman" w:hAnsi="Times New Roman" w:cs="Times New Roman"/>
           <w:b/>
           <w:sz w:val="20"/>
+        </w:rPr>
+        <w:t>_Haris_Ali</w:t>
+      </w:r>
+      <w:r>
+        <w:rPr>
+          <w:rFonts w:ascii="Times New Roman" w:eastAsia="Times New Roman" w:hAnsi="Times New Roman" w:cs="Times New Roman"/>
+          <w:b/>
+          <w:sz w:val="20"/>
           <w:u w:val="single"/>
         </w:rPr>
         <w:tab/>
@@ -1115,6 +1164,14 @@
         </w:rPr>
         <w:tab/>
         <w:t xml:space="preserve">Roll No: </w:t>
+      </w:r>
+      <w:r>
+        <w:rPr>
+          <w:rFonts w:ascii="Times New Roman" w:eastAsia="Times New Roman" w:hAnsi="Times New Roman" w:cs="Times New Roman"/>
+          <w:b/>
+          <w:sz w:val="20"/>
+        </w:rPr>
+        <w:t>_Su91-Bietm-F23-057</w:t>
       </w:r>
       <w:r>
         <w:rPr>
@@ -4458,7 +4515,29 @@
           <w:sz w:val="30"/>
           <w:szCs w:val="30"/>
         </w:rPr>
-        <w:t xml:space="preserve"> Add relevant packages into the app (http, dio, chopper, etc.).</w:t>
+        <w:t xml:space="preserve"> Add relevant packages into the app (http, </w:t>
+      </w:r>
+      <w:proofErr w:type="spellStart"/>
+      <w:r>
+        <w:rPr>
+          <w:rFonts w:ascii="Times New Roman" w:eastAsia="Times New Roman" w:hAnsi="Times New Roman" w:cs="Times New Roman"/>
+          <w:color w:val="242424"/>
+          <w:spacing w:val="-1"/>
+          <w:sz w:val="30"/>
+          <w:szCs w:val="30"/>
+        </w:rPr>
+        <w:t>dio</w:t>
+      </w:r>
+      <w:proofErr w:type="spellEnd"/>
+      <w:r>
+        <w:rPr>
+          <w:rFonts w:ascii="Times New Roman" w:eastAsia="Times New Roman" w:hAnsi="Times New Roman" w:cs="Times New Roman"/>
+          <w:color w:val="242424"/>
+          <w:spacing w:val="-1"/>
+          <w:sz w:val="30"/>
+          <w:szCs w:val="30"/>
+        </w:rPr>
+        <w:t>, chopper, etc.).</w:t>
       </w:r>
     </w:p>
     <w:p>
@@ -4649,19 +4728,39 @@
         </w:rPr>
         <w:t>will use </w:t>
       </w:r>
-      <w:hyperlink r:id="rId13" w:tgtFrame="_blank" w:history="1">
-        <w:r>
-          <w:rPr>
-            <w:rFonts w:ascii="Times New Roman" w:eastAsia="Times New Roman" w:hAnsi="Times New Roman" w:cs="Times New Roman"/>
-            <w:color w:val="0000FF"/>
-            <w:spacing w:val="-1"/>
-            <w:sz w:val="30"/>
-            <w:szCs w:val="30"/>
-            <w:u w:val="single"/>
-          </w:rPr>
-          <w:t>JSONPlaceholder</w:t>
-        </w:r>
-      </w:hyperlink>
+      <w:proofErr w:type="spellStart"/>
+      <w:r>
+        <w:fldChar w:fldCharType="begin"/>
+      </w:r>
+      <w:r>
+        <w:instrText xml:space="preserve"> HYPERLINK "https://jsonplaceholder.typicode.com/" \t "_blank" </w:instrText>
+      </w:r>
+      <w:r>
+        <w:fldChar w:fldCharType="separate"/>
+      </w:r>
+      <w:r>
+        <w:rPr>
+          <w:rFonts w:ascii="Times New Roman" w:eastAsia="Times New Roman" w:hAnsi="Times New Roman" w:cs="Times New Roman"/>
+          <w:color w:val="0000FF"/>
+          <w:spacing w:val="-1"/>
+          <w:sz w:val="30"/>
+          <w:szCs w:val="30"/>
+          <w:u w:val="single"/>
+        </w:rPr>
+        <w:t>JSONPlaceholder</w:t>
+      </w:r>
+      <w:proofErr w:type="spellEnd"/>
+      <w:r>
+        <w:rPr>
+          <w:rFonts w:ascii="Times New Roman" w:eastAsia="Times New Roman" w:hAnsi="Times New Roman" w:cs="Times New Roman"/>
+          <w:color w:val="0000FF"/>
+          <w:spacing w:val="-1"/>
+          <w:sz w:val="30"/>
+          <w:szCs w:val="30"/>
+          <w:u w:val="single"/>
+        </w:rPr>
+        <w:fldChar w:fldCharType="end"/>
+      </w:r>
       <w:r>
         <w:rPr>
           <w:rFonts w:ascii="Times New Roman" w:eastAsia="Times New Roman" w:hAnsi="Times New Roman" w:cs="Times New Roman"/>
@@ -4727,28 +4826,70 @@
         </w:rPr>
         <w:t>To get the API URL (referred to as base URL) and endpoints, go to the </w:t>
       </w:r>
-      <w:hyperlink r:id="rId14" w:tgtFrame="_blank" w:history="1">
-        <w:r>
-          <w:rPr>
-            <w:rFonts w:ascii="Times New Roman" w:eastAsia="Times New Roman" w:hAnsi="Times New Roman" w:cs="Times New Roman"/>
-            <w:color w:val="0000FF"/>
-            <w:spacing w:val="-1"/>
-            <w:sz w:val="30"/>
-            <w:szCs w:val="30"/>
-            <w:u w:val="single"/>
-          </w:rPr>
-          <w:t>JSONPlaceholder</w:t>
-        </w:r>
-      </w:hyperlink>
-      <w:r>
-        <w:rPr>
-          <w:rFonts w:ascii="Times New Roman" w:eastAsia="Times New Roman" w:hAnsi="Times New Roman" w:cs="Times New Roman"/>
-          <w:color w:val="242424"/>
-          <w:spacing w:val="-1"/>
-          <w:sz w:val="30"/>
-          <w:szCs w:val="30"/>
-        </w:rPr>
-        <w:t> website and you will find different APIs that they provide. We would today use the users API that they have. Hence,</w:t>
+      <w:proofErr w:type="spellStart"/>
+      <w:r>
+        <w:fldChar w:fldCharType="begin"/>
+      </w:r>
+      <w:r>
+        <w:instrText xml:space="preserve"> HYPERLINK "https://jsonplaceholder.typicode.com/" \t "_blank" </w:instrText>
+      </w:r>
+      <w:r>
+        <w:fldChar w:fldCharType="separate"/>
+      </w:r>
+      <w:r>
+        <w:rPr>
+          <w:rFonts w:ascii="Times New Roman" w:eastAsia="Times New Roman" w:hAnsi="Times New Roman" w:cs="Times New Roman"/>
+          <w:color w:val="0000FF"/>
+          <w:spacing w:val="-1"/>
+          <w:sz w:val="30"/>
+          <w:szCs w:val="30"/>
+          <w:u w:val="single"/>
+        </w:rPr>
+        <w:t>JSONPlaceholder</w:t>
+      </w:r>
+      <w:proofErr w:type="spellEnd"/>
+      <w:r>
+        <w:rPr>
+          <w:rFonts w:ascii="Times New Roman" w:eastAsia="Times New Roman" w:hAnsi="Times New Roman" w:cs="Times New Roman"/>
+          <w:color w:val="0000FF"/>
+          <w:spacing w:val="-1"/>
+          <w:sz w:val="30"/>
+          <w:szCs w:val="30"/>
+          <w:u w:val="single"/>
+        </w:rPr>
+        <w:fldChar w:fldCharType="end"/>
+      </w:r>
+      <w:r>
+        <w:rPr>
+          <w:rFonts w:ascii="Times New Roman" w:eastAsia="Times New Roman" w:hAnsi="Times New Roman" w:cs="Times New Roman"/>
+          <w:color w:val="242424"/>
+          <w:spacing w:val="-1"/>
+          <w:sz w:val="30"/>
+          <w:szCs w:val="30"/>
+        </w:rPr>
+        <w:t xml:space="preserve"> website and you will find different APIs that they provide. We would today use the </w:t>
+      </w:r>
+      <w:proofErr w:type="gramStart"/>
+      <w:r>
+        <w:rPr>
+          <w:rFonts w:ascii="Times New Roman" w:eastAsia="Times New Roman" w:hAnsi="Times New Roman" w:cs="Times New Roman"/>
+          <w:color w:val="242424"/>
+          <w:spacing w:val="-1"/>
+          <w:sz w:val="30"/>
+          <w:szCs w:val="30"/>
+        </w:rPr>
+        <w:t>users</w:t>
+      </w:r>
+      <w:proofErr w:type="gramEnd"/>
+      <w:r>
+        <w:rPr>
+          <w:rFonts w:ascii="Times New Roman" w:eastAsia="Times New Roman" w:hAnsi="Times New Roman" w:cs="Times New Roman"/>
+          <w:color w:val="242424"/>
+          <w:spacing w:val="-1"/>
+          <w:sz w:val="30"/>
+          <w:szCs w:val="30"/>
+        </w:rPr>
+        <w:t xml:space="preserve"> API that they have. Hence,</w:t>
       </w:r>
     </w:p>
     <w:p>
@@ -4844,7 +4985,29 @@
           <w:sz w:val="30"/>
           <w:szCs w:val="30"/>
         </w:rPr>
-        <w:t>When you have a database or API provider, the base URL for all APIs remain the same however the endpoint changes depending on the API. In many API Providers, you will have to obtain a private key (API Key or Access Key) either by simply creating an account or it can be a paid one. That API Key will be just appended to the base URL. So the new base URL will be:</w:t>
+        <w:t xml:space="preserve">When you have a database or API provider, the base URL for all APIs remain the same however the endpoint changes depending on the API. In many API Providers, you will have to obtain a private key (API Key or Access Key) either by simply creating an account or it can be a paid one. That API Key will be just appended to the base URL. </w:t>
+      </w:r>
+      <w:proofErr w:type="gramStart"/>
+      <w:r>
+        <w:rPr>
+          <w:rFonts w:ascii="Times New Roman" w:eastAsia="Times New Roman" w:hAnsi="Times New Roman" w:cs="Times New Roman"/>
+          <w:color w:val="242424"/>
+          <w:spacing w:val="-1"/>
+          <w:sz w:val="30"/>
+          <w:szCs w:val="30"/>
+        </w:rPr>
+        <w:t>So</w:t>
+      </w:r>
+      <w:proofErr w:type="gramEnd"/>
+      <w:r>
+        <w:rPr>
+          <w:rFonts w:ascii="Times New Roman" w:eastAsia="Times New Roman" w:hAnsi="Times New Roman" w:cs="Times New Roman"/>
+          <w:color w:val="242424"/>
+          <w:spacing w:val="-1"/>
+          <w:sz w:val="30"/>
+          <w:szCs w:val="30"/>
+        </w:rPr>
+        <w:t xml:space="preserve"> the new base URL will be:</w:t>
       </w:r>
     </w:p>
     <w:p>
@@ -4870,8 +5033,42 @@
           <w:sz w:val="30"/>
           <w:szCs w:val="30"/>
         </w:rPr>
-        <w:t>New Base URL = BaseUrl/apiKey</w:t>
-      </w:r>
+        <w:t xml:space="preserve">New Base URL = </w:t>
+      </w:r>
+      <w:proofErr w:type="spellStart"/>
+      <w:r>
+        <w:rPr>
+          <w:rFonts w:ascii="Times New Roman" w:eastAsia="Times New Roman" w:hAnsi="Times New Roman" w:cs="Times New Roman"/>
+          <w:color w:val="242424"/>
+          <w:spacing w:val="-1"/>
+          <w:sz w:val="30"/>
+          <w:szCs w:val="30"/>
+        </w:rPr>
+        <w:t>BaseUrl</w:t>
+      </w:r>
+      <w:proofErr w:type="spellEnd"/>
+      <w:r>
+        <w:rPr>
+          <w:rFonts w:ascii="Times New Roman" w:eastAsia="Times New Roman" w:hAnsi="Times New Roman" w:cs="Times New Roman"/>
+          <w:color w:val="242424"/>
+          <w:spacing w:val="-1"/>
+          <w:sz w:val="30"/>
+          <w:szCs w:val="30"/>
+        </w:rPr>
+        <w:t>/</w:t>
+      </w:r>
+      <w:proofErr w:type="spellStart"/>
+      <w:r>
+        <w:rPr>
+          <w:rFonts w:ascii="Times New Roman" w:eastAsia="Times New Roman" w:hAnsi="Times New Roman" w:cs="Times New Roman"/>
+          <w:color w:val="242424"/>
+          <w:spacing w:val="-1"/>
+          <w:sz w:val="30"/>
+          <w:szCs w:val="30"/>
+        </w:rPr>
+        <w:t>apiKey</w:t>
+      </w:r>
+      <w:proofErr w:type="spellEnd"/>
     </w:p>
     <w:p>
       <w:pPr>
@@ -4925,7 +5122,31 @@
           <w:sz w:val="30"/>
           <w:szCs w:val="30"/>
         </w:rPr>
-        <w:t>Step 2: Add relevant packages into the app (http, dio, chopper, etc.)</w:t>
+        <w:t xml:space="preserve">Step 2: Add relevant packages into the app (http, </w:t>
+      </w:r>
+      <w:proofErr w:type="spellStart"/>
+      <w:r>
+        <w:rPr>
+          <w:rFonts w:ascii="Times New Roman" w:eastAsia="Times New Roman" w:hAnsi="Times New Roman" w:cs="Times New Roman"/>
+          <w:b/>
+          <w:bCs/>
+          <w:color w:val="242424"/>
+          <w:sz w:val="30"/>
+          <w:szCs w:val="30"/>
+        </w:rPr>
+        <w:t>dio</w:t>
+      </w:r>
+      <w:proofErr w:type="spellEnd"/>
+      <w:r>
+        <w:rPr>
+          <w:rFonts w:ascii="Times New Roman" w:eastAsia="Times New Roman" w:hAnsi="Times New Roman" w:cs="Times New Roman"/>
+          <w:b/>
+          <w:bCs/>
+          <w:color w:val="242424"/>
+          <w:sz w:val="30"/>
+          <w:szCs w:val="30"/>
+        </w:rPr>
+        <w:t>, chopper, etc.)</w:t>
       </w:r>
     </w:p>
     <w:p>
@@ -4965,21 +5186,43 @@
         </w:rPr>
         <w:t> </w:t>
       </w:r>
-      <w:hyperlink r:id="rId15" w:tgtFrame="_blank" w:history="1">
-        <w:r>
-          <w:rPr>
-            <w:rFonts w:ascii="Times New Roman" w:eastAsia="Times New Roman" w:hAnsi="Times New Roman" w:cs="Times New Roman"/>
-            <w:b/>
-            <w:bCs/>
-            <w:color w:val="0000FF"/>
-            <w:spacing w:val="-1"/>
-            <w:sz w:val="30"/>
-            <w:szCs w:val="30"/>
-            <w:u w:val="single"/>
-          </w:rPr>
-          <w:t>pub.dev</w:t>
-        </w:r>
-      </w:hyperlink>
+      <w:proofErr w:type="spellStart"/>
+      <w:r>
+        <w:fldChar w:fldCharType="begin"/>
+      </w:r>
+      <w:r>
+        <w:instrText xml:space="preserve"> HYPERLINK "http://pub.dev/" \t "_blank" </w:instrText>
+      </w:r>
+      <w:r>
+        <w:fldChar w:fldCharType="separate"/>
+      </w:r>
+      <w:r>
+        <w:rPr>
+          <w:rFonts w:ascii="Times New Roman" w:eastAsia="Times New Roman" w:hAnsi="Times New Roman" w:cs="Times New Roman"/>
+          <w:b/>
+          <w:bCs/>
+          <w:color w:val="0000FF"/>
+          <w:spacing w:val="-1"/>
+          <w:sz w:val="30"/>
+          <w:szCs w:val="30"/>
+          <w:u w:val="single"/>
+        </w:rPr>
+        <w:t>pub.dev</w:t>
+      </w:r>
+      <w:proofErr w:type="spellEnd"/>
+      <w:r>
+        <w:rPr>
+          <w:rFonts w:ascii="Times New Roman" w:eastAsia="Times New Roman" w:hAnsi="Times New Roman" w:cs="Times New Roman"/>
+          <w:b/>
+          <w:bCs/>
+          <w:color w:val="0000FF"/>
+          <w:spacing w:val="-1"/>
+          <w:sz w:val="30"/>
+          <w:szCs w:val="30"/>
+          <w:u w:val="single"/>
+        </w:rPr>
+        <w:fldChar w:fldCharType="end"/>
+      </w:r>
       <w:r>
         <w:rPr>
           <w:rFonts w:ascii="Times New Roman" w:eastAsia="Times New Roman" w:hAnsi="Times New Roman" w:cs="Times New Roman"/>
@@ -5011,7 +5254,7 @@
           <w:szCs w:val="30"/>
         </w:rPr>
       </w:pPr>
-      <w:hyperlink r:id="rId16" w:tgtFrame="_blank" w:history="1">
+      <w:hyperlink r:id="rId13" w:tgtFrame="_blank" w:history="1">
         <w:r>
           <w:rPr>
             <w:rFonts w:ascii="Times New Roman" w:eastAsia="Times New Roman" w:hAnsi="Times New Roman" w:cs="Times New Roman"/>
@@ -5045,7 +5288,8 @@
           <w:szCs w:val="30"/>
         </w:rPr>
       </w:pPr>
-      <w:hyperlink r:id="rId17" w:tgtFrame="_blank" w:history="1">
+      <w:hyperlink r:id="rId14" w:tgtFrame="_blank" w:history="1">
+        <w:proofErr w:type="spellStart"/>
         <w:r>
           <w:rPr>
             <w:rFonts w:ascii="Times New Roman" w:eastAsia="Times New Roman" w:hAnsi="Times New Roman" w:cs="Times New Roman"/>
@@ -5057,6 +5301,7 @@
           </w:rPr>
           <w:t>dio</w:t>
         </w:r>
+        <w:proofErr w:type="spellEnd"/>
       </w:hyperlink>
     </w:p>
     <w:p>
@@ -5079,7 +5324,7 @@
           <w:szCs w:val="30"/>
         </w:rPr>
       </w:pPr>
-      <w:hyperlink r:id="rId18" w:tgtFrame="_blank" w:history="1">
+      <w:hyperlink r:id="rId15" w:tgtFrame="_blank" w:history="1">
         <w:r>
           <w:rPr>
             <w:rFonts w:ascii="Times New Roman" w:eastAsia="Times New Roman" w:hAnsi="Times New Roman" w:cs="Times New Roman"/>
@@ -5142,7 +5387,29 @@
           <w:sz w:val="30"/>
           <w:szCs w:val="30"/>
         </w:rPr>
-        <w:t>Now, once you have created a new flutter project, go to pubspec.yaml file and add the http package into it. Your file should look something like the following:</w:t>
+        <w:t xml:space="preserve">Now, once you have created a new flutter project, go to </w:t>
+      </w:r>
+      <w:proofErr w:type="spellStart"/>
+      <w:r>
+        <w:rPr>
+          <w:rFonts w:ascii="Times New Roman" w:eastAsia="Times New Roman" w:hAnsi="Times New Roman" w:cs="Times New Roman"/>
+          <w:color w:val="242424"/>
+          <w:spacing w:val="-1"/>
+          <w:sz w:val="30"/>
+          <w:szCs w:val="30"/>
+        </w:rPr>
+        <w:t>pubspec.yaml</w:t>
+      </w:r>
+      <w:proofErr w:type="spellEnd"/>
+      <w:r>
+        <w:rPr>
+          <w:rFonts w:ascii="Times New Roman" w:eastAsia="Times New Roman" w:hAnsi="Times New Roman" w:cs="Times New Roman"/>
+          <w:color w:val="242424"/>
+          <w:spacing w:val="-1"/>
+          <w:sz w:val="30"/>
+          <w:szCs w:val="30"/>
+        </w:rPr>
+        <w:t xml:space="preserve"> file and add the http package into it. Your file should look something like the following:</w:t>
       </w:r>
     </w:p>
     <w:p>
@@ -5185,7 +5452,7 @@
                     <pic:cNvPicPr/>
                   </pic:nvPicPr>
                   <pic:blipFill>
-                    <a:blip r:embed="rId19"/>
+                    <a:blip r:embed="rId16"/>
                     <a:stretch>
                       <a:fillRect/>
                     </a:stretch>
@@ -5260,6 +5527,8 @@
         </w:rPr>
         <w:t>Now, it’s time to create a simple file named </w:t>
       </w:r>
+      <w:proofErr w:type="spellStart"/>
+      <w:proofErr w:type="gramStart"/>
       <w:r>
         <w:rPr>
           <w:rFonts w:ascii="Times New Roman" w:eastAsia="Times New Roman" w:hAnsi="Times New Roman" w:cs="Times New Roman"/>
@@ -5271,6 +5540,8 @@
         </w:rPr>
         <w:t>constants.dart</w:t>
       </w:r>
+      <w:proofErr w:type="spellEnd"/>
+      <w:proofErr w:type="gramEnd"/>
       <w:r>
         <w:rPr>
           <w:rFonts w:ascii="Times New Roman" w:eastAsia="Times New Roman" w:hAnsi="Times New Roman" w:cs="Times New Roman"/>
@@ -5322,7 +5593,7 @@
                     <pic:cNvPicPr/>
                   </pic:nvPicPr>
                   <pic:blipFill>
-                    <a:blip r:embed="rId20"/>
+                    <a:blip r:embed="rId17"/>
                     <a:stretch>
                       <a:fillRect/>
                     </a:stretch>
@@ -5367,8 +5638,32 @@
           <w:szCs w:val="30"/>
         </w:rPr>
         <w:lastRenderedPageBreak/>
-        <w:t>Here, we have created a class called ApiConstants and created 2 static variables so that we can access them without creating an instance of the class like </w:t>
-      </w:r>
+        <w:t xml:space="preserve">Here, we have created a class called </w:t>
+      </w:r>
+      <w:proofErr w:type="spellStart"/>
+      <w:r>
+        <w:rPr>
+          <w:rFonts w:ascii="Times New Roman" w:eastAsia="Times New Roman" w:hAnsi="Times New Roman" w:cs="Times New Roman"/>
+          <w:color w:val="242424"/>
+          <w:spacing w:val="-1"/>
+          <w:sz w:val="30"/>
+          <w:szCs w:val="30"/>
+        </w:rPr>
+        <w:t>ApiConstants</w:t>
+      </w:r>
+      <w:proofErr w:type="spellEnd"/>
+      <w:r>
+        <w:rPr>
+          <w:rFonts w:ascii="Times New Roman" w:eastAsia="Times New Roman" w:hAnsi="Times New Roman" w:cs="Times New Roman"/>
+          <w:color w:val="242424"/>
+          <w:spacing w:val="-1"/>
+          <w:sz w:val="30"/>
+          <w:szCs w:val="30"/>
+        </w:rPr>
+        <w:t xml:space="preserve"> and created 2 static variables so that we can access them without creating an instance of the class like </w:t>
+      </w:r>
+      <w:proofErr w:type="spellStart"/>
+      <w:proofErr w:type="gramStart"/>
       <w:r>
         <w:rPr>
           <w:rFonts w:ascii="Times New Roman" w:eastAsia="Times New Roman" w:hAnsi="Times New Roman" w:cs="Times New Roman"/>
@@ -5380,6 +5675,7 @@
         </w:rPr>
         <w:t>ApiConstants.baseUrl</w:t>
       </w:r>
+      <w:proofErr w:type="spellEnd"/>
       <w:r>
         <w:rPr>
           <w:rFonts w:ascii="Times New Roman" w:eastAsia="Times New Roman" w:hAnsi="Times New Roman" w:cs="Times New Roman"/>
@@ -5390,6 +5686,7 @@
         </w:rPr>
         <w:t> .</w:t>
       </w:r>
+      <w:proofErr w:type="gramEnd"/>
     </w:p>
     <w:p>
       <w:pPr>
@@ -5525,7 +5822,29 @@
           <w:sz w:val="24"/>
           <w:szCs w:val="24"/>
         </w:rPr>
-        <w:t>final data = json[0]['id'];</w:t>
+        <w:t>final data = json[</w:t>
+      </w:r>
+      <w:proofErr w:type="gramStart"/>
+      <w:r>
+        <w:rPr>
+          <w:rFonts w:ascii="Times New Roman" w:eastAsia="Times New Roman" w:hAnsi="Times New Roman" w:cs="Times New Roman"/>
+          <w:color w:val="242424"/>
+          <w:spacing w:val="-5"/>
+          <w:sz w:val="24"/>
+          <w:szCs w:val="24"/>
+        </w:rPr>
+        <w:t>0][</w:t>
+      </w:r>
+      <w:proofErr w:type="gramEnd"/>
+      <w:r>
+        <w:rPr>
+          <w:rFonts w:ascii="Times New Roman" w:eastAsia="Times New Roman" w:hAnsi="Times New Roman" w:cs="Times New Roman"/>
+          <w:color w:val="242424"/>
+          <w:spacing w:val="-5"/>
+          <w:sz w:val="24"/>
+          <w:szCs w:val="24"/>
+        </w:rPr>
+        <w:t>'id'];</w:t>
       </w:r>
     </w:p>
     <w:p>
@@ -5600,7 +5919,7 @@
         </w:rPr>
         <w:t>Now, to create a model class, first, you will need the entire JSON response that you are getting from the API. To get that, just go to </w:t>
       </w:r>
-      <w:hyperlink r:id="rId21" w:tgtFrame="_blank" w:history="1">
+      <w:hyperlink r:id="rId18" w:tgtFrame="_blank" w:history="1">
         <w:r>
           <w:rPr>
             <w:rFonts w:ascii="Times New Roman" w:eastAsia="Times New Roman" w:hAnsi="Times New Roman" w:cs="Times New Roman"/>
@@ -5623,7 +5942,7 @@
         </w:rPr>
         <w:t> and you will be able to obtain the entire JSON response as this is a public API. Now, in the case of private API or custom backend APIs, either it will be available in the documentation or you can use </w:t>
       </w:r>
-      <w:hyperlink r:id="rId22" w:tgtFrame="_blank" w:history="1">
+      <w:hyperlink r:id="rId19" w:tgtFrame="_blank" w:history="1">
         <w:r>
           <w:rPr>
             <w:rFonts w:ascii="Times New Roman" w:eastAsia="Times New Roman" w:hAnsi="Times New Roman" w:cs="Times New Roman"/>
@@ -5672,7 +5991,7 @@
         </w:rPr>
         <w:t>Now, once you have the response, you can create the model class using a simple method. Go to </w:t>
       </w:r>
-      <w:hyperlink r:id="rId23" w:tgtFrame="_blank" w:history="1">
+      <w:hyperlink r:id="rId20" w:tgtFrame="_blank" w:history="1">
         <w:r>
           <w:rPr>
             <w:rFonts w:ascii="Times New Roman" w:eastAsia="Times New Roman" w:hAnsi="Times New Roman" w:cs="Times New Roman"/>
@@ -5755,7 +6074,7 @@
                     </pic:cNvPicPr>
                   </pic:nvPicPr>
                   <pic:blipFill>
-                    <a:blip r:embed="rId24">
+                    <a:blip r:embed="rId21">
                       <a:extLst>
                         <a:ext uri="{28A0092B-C50C-407E-A947-70E740481C1C}">
                           <a14:useLocalDpi xmlns:a14="http://schemas.microsoft.com/office/drawing/2010/main" val="0"/>
@@ -5853,7 +6172,7 @@
                     <pic:cNvPicPr/>
                   </pic:nvPicPr>
                   <pic:blipFill>
-                    <a:blip r:embed="rId25"/>
+                    <a:blip r:embed="rId22"/>
                     <a:stretch>
                       <a:fillRect/>
                     </a:stretch>
@@ -5931,7 +6250,7 @@
                     <pic:cNvPicPr/>
                   </pic:nvPicPr>
                   <pic:blipFill>
-                    <a:blip r:embed="rId26">
+                    <a:blip r:embed="rId23">
                       <a:extLst>
                         <a:ext uri="{28A0092B-C50C-407E-A947-70E740481C1C}">
                           <a14:useLocalDpi xmlns:a14="http://schemas.microsoft.com/office/drawing/2010/main" val="0"/>
@@ -6017,7 +6336,7 @@
                     <pic:cNvPicPr/>
                   </pic:nvPicPr>
                   <pic:blipFill>
-                    <a:blip r:embed="rId27">
+                    <a:blip r:embed="rId24">
                       <a:extLst>
                         <a:ext uri="{28A0092B-C50C-407E-A947-70E740481C1C}">
                           <a14:useLocalDpi xmlns:a14="http://schemas.microsoft.com/office/drawing/2010/main" val="0"/>
@@ -6091,7 +6410,7 @@
                     <pic:cNvPicPr/>
                   </pic:nvPicPr>
                   <pic:blipFill>
-                    <a:blip r:embed="rId28"/>
+                    <a:blip r:embed="rId25"/>
                     <a:stretch>
                       <a:fillRect/>
                     </a:stretch>
@@ -6152,7 +6471,7 @@
                     <pic:cNvPicPr/>
                   </pic:nvPicPr>
                   <pic:blipFill>
-                    <a:blip r:embed="rId29"/>
+                    <a:blip r:embed="rId26"/>
                     <a:stretch>
                       <a:fillRect/>
                     </a:stretch>
@@ -6228,6 +6547,7 @@
         </w:rPr>
         <w:t>Now, create a file called </w:t>
       </w:r>
+      <w:proofErr w:type="spellStart"/>
       <w:r>
         <w:rPr>
           <w:rFonts w:ascii="Times New Roman" w:eastAsia="Times New Roman" w:hAnsi="Times New Roman" w:cs="Times New Roman"/>
@@ -6237,8 +6557,22 @@
           <w:szCs w:val="23"/>
           <w:shd w:val="clear" w:color="auto" w:fill="F2F2F2"/>
         </w:rPr>
-        <w:t>api_service.dart</w:t>
-      </w:r>
+        <w:t>api_</w:t>
+      </w:r>
+      <w:proofErr w:type="gramStart"/>
+      <w:r>
+        <w:rPr>
+          <w:rFonts w:ascii="Times New Roman" w:eastAsia="Times New Roman" w:hAnsi="Times New Roman" w:cs="Times New Roman"/>
+          <w:color w:val="242424"/>
+          <w:spacing w:val="-1"/>
+          <w:sz w:val="23"/>
+          <w:szCs w:val="23"/>
+          <w:shd w:val="clear" w:color="auto" w:fill="F2F2F2"/>
+        </w:rPr>
+        <w:t>service.dart</w:t>
+      </w:r>
+      <w:proofErr w:type="spellEnd"/>
+      <w:proofErr w:type="gramEnd"/>
       <w:r>
         <w:rPr>
           <w:rFonts w:ascii="Times New Roman" w:eastAsia="Times New Roman" w:hAnsi="Times New Roman" w:cs="Times New Roman"/>
@@ -6290,7 +6624,7 @@
                     <pic:cNvPicPr/>
                   </pic:nvPicPr>
                   <pic:blipFill>
-                    <a:blip r:embed="rId30"/>
+                    <a:blip r:embed="rId27"/>
                     <a:stretch>
                       <a:fillRect/>
                     </a:stretch>
@@ -6346,6 +6680,7 @@
         </w:rPr>
         <w:t>Now, in the above file, we have created a function called </w:t>
       </w:r>
+      <w:proofErr w:type="spellStart"/>
       <w:r>
         <w:rPr>
           <w:rFonts w:ascii="Times New Roman" w:eastAsia="Times New Roman" w:hAnsi="Times New Roman" w:cs="Times New Roman"/>
@@ -6357,6 +6692,7 @@
         </w:rPr>
         <w:t>getUsers</w:t>
       </w:r>
+      <w:proofErr w:type="spellEnd"/>
       <w:r>
         <w:rPr>
           <w:rFonts w:ascii="Times New Roman" w:eastAsia="Times New Roman" w:hAnsi="Times New Roman" w:cs="Times New Roman"/>
@@ -6376,18 +6712,9 @@
           <w:szCs w:val="23"/>
           <w:shd w:val="clear" w:color="auto" w:fill="F2F2F2"/>
         </w:rPr>
-        <w:t>List&lt;UserModel&gt;</w:t>
-      </w:r>
-      <w:r>
-        <w:rPr>
-          <w:rFonts w:ascii="Times New Roman" w:eastAsia="Times New Roman" w:hAnsi="Times New Roman" w:cs="Times New Roman"/>
-          <w:color w:val="242424"/>
-          <w:spacing w:val="-1"/>
-          <w:sz w:val="30"/>
-          <w:szCs w:val="30"/>
-        </w:rPr>
-        <w:t> . The first step is to hit the GET HTTP request. The next step is to check, whether the API call was successful or not. That can be checked using </w:t>
-      </w:r>
+        <w:t>List&lt;</w:t>
+      </w:r>
+      <w:proofErr w:type="spellStart"/>
       <w:r>
         <w:rPr>
           <w:rFonts w:ascii="Times New Roman" w:eastAsia="Times New Roman" w:hAnsi="Times New Roman" w:cs="Times New Roman"/>
@@ -6397,18 +6724,10 @@
           <w:szCs w:val="23"/>
           <w:shd w:val="clear" w:color="auto" w:fill="F2F2F2"/>
         </w:rPr>
-        <w:t>response.statusCode</w:t>
-      </w:r>
-      <w:r>
-        <w:rPr>
-          <w:rFonts w:ascii="Times New Roman" w:eastAsia="Times New Roman" w:hAnsi="Times New Roman" w:cs="Times New Roman"/>
-          <w:color w:val="242424"/>
-          <w:spacing w:val="-1"/>
-          <w:sz w:val="30"/>
-          <w:szCs w:val="30"/>
-        </w:rPr>
-        <w:t> . If the API call will be successful, statusCode will be 200. If the statusCode is 200, we then convert the JSON (response.body) into a </w:t>
-      </w:r>
+        <w:t>UserModel</w:t>
+      </w:r>
+      <w:proofErr w:type="spellEnd"/>
+      <w:proofErr w:type="gramStart"/>
       <w:r>
         <w:rPr>
           <w:rFonts w:ascii="Times New Roman" w:eastAsia="Times New Roman" w:hAnsi="Times New Roman" w:cs="Times New Roman"/>
@@ -6418,18 +6737,31 @@
           <w:szCs w:val="23"/>
           <w:shd w:val="clear" w:color="auto" w:fill="F2F2F2"/>
         </w:rPr>
-        <w:t>List&lt;UserModel&gt;</w:t>
-      </w:r>
-      <w:r>
-        <w:rPr>
-          <w:rFonts w:ascii="Times New Roman" w:eastAsia="Times New Roman" w:hAnsi="Times New Roman" w:cs="Times New Roman"/>
-          <w:color w:val="242424"/>
-          <w:spacing w:val="-1"/>
-          <w:sz w:val="30"/>
-          <w:szCs w:val="30"/>
-        </w:rPr>
-        <w:t> using the method </w:t>
-      </w:r>
+        <w:t>&gt;</w:t>
+      </w:r>
+      <w:r>
+        <w:rPr>
+          <w:rFonts w:ascii="Times New Roman" w:eastAsia="Times New Roman" w:hAnsi="Times New Roman" w:cs="Times New Roman"/>
+          <w:color w:val="242424"/>
+          <w:spacing w:val="-1"/>
+          <w:sz w:val="30"/>
+          <w:szCs w:val="30"/>
+        </w:rPr>
+        <w:t> .</w:t>
+      </w:r>
+      <w:proofErr w:type="gramEnd"/>
+      <w:r>
+        <w:rPr>
+          <w:rFonts w:ascii="Times New Roman" w:eastAsia="Times New Roman" w:hAnsi="Times New Roman" w:cs="Times New Roman"/>
+          <w:color w:val="242424"/>
+          <w:spacing w:val="-1"/>
+          <w:sz w:val="30"/>
+          <w:szCs w:val="30"/>
+        </w:rPr>
+        <w:t xml:space="preserve"> The first step is to hit the GET HTTP request. The next step is to check, whether the API call was successful or not. That can be checked using </w:t>
+      </w:r>
+      <w:proofErr w:type="spellStart"/>
+      <w:proofErr w:type="gramStart"/>
       <w:r>
         <w:rPr>
           <w:rFonts w:ascii="Times New Roman" w:eastAsia="Times New Roman" w:hAnsi="Times New Roman" w:cs="Times New Roman"/>
@@ -6439,8 +6771,146 @@
           <w:szCs w:val="23"/>
           <w:shd w:val="clear" w:color="auto" w:fill="F2F2F2"/>
         </w:rPr>
+        <w:t>response.statusCode</w:t>
+      </w:r>
+      <w:proofErr w:type="spellEnd"/>
+      <w:proofErr w:type="gramEnd"/>
+      <w:r>
+        <w:rPr>
+          <w:rFonts w:ascii="Times New Roman" w:eastAsia="Times New Roman" w:hAnsi="Times New Roman" w:cs="Times New Roman"/>
+          <w:color w:val="242424"/>
+          <w:spacing w:val="-1"/>
+          <w:sz w:val="30"/>
+          <w:szCs w:val="30"/>
+        </w:rPr>
+        <w:t xml:space="preserve"> . If the API call will be successful, </w:t>
+      </w:r>
+      <w:proofErr w:type="spellStart"/>
+      <w:r>
+        <w:rPr>
+          <w:rFonts w:ascii="Times New Roman" w:eastAsia="Times New Roman" w:hAnsi="Times New Roman" w:cs="Times New Roman"/>
+          <w:color w:val="242424"/>
+          <w:spacing w:val="-1"/>
+          <w:sz w:val="30"/>
+          <w:szCs w:val="30"/>
+        </w:rPr>
+        <w:t>statusCode</w:t>
+      </w:r>
+      <w:proofErr w:type="spellEnd"/>
+      <w:r>
+        <w:rPr>
+          <w:rFonts w:ascii="Times New Roman" w:eastAsia="Times New Roman" w:hAnsi="Times New Roman" w:cs="Times New Roman"/>
+          <w:color w:val="242424"/>
+          <w:spacing w:val="-1"/>
+          <w:sz w:val="30"/>
+          <w:szCs w:val="30"/>
+        </w:rPr>
+        <w:t xml:space="preserve"> will be 200. If the </w:t>
+      </w:r>
+      <w:proofErr w:type="spellStart"/>
+      <w:r>
+        <w:rPr>
+          <w:rFonts w:ascii="Times New Roman" w:eastAsia="Times New Roman" w:hAnsi="Times New Roman" w:cs="Times New Roman"/>
+          <w:color w:val="242424"/>
+          <w:spacing w:val="-1"/>
+          <w:sz w:val="30"/>
+          <w:szCs w:val="30"/>
+        </w:rPr>
+        <w:t>statusCode</w:t>
+      </w:r>
+      <w:proofErr w:type="spellEnd"/>
+      <w:r>
+        <w:rPr>
+          <w:rFonts w:ascii="Times New Roman" w:eastAsia="Times New Roman" w:hAnsi="Times New Roman" w:cs="Times New Roman"/>
+          <w:color w:val="242424"/>
+          <w:spacing w:val="-1"/>
+          <w:sz w:val="30"/>
+          <w:szCs w:val="30"/>
+        </w:rPr>
+        <w:t xml:space="preserve"> is 200, we then convert the JSON (</w:t>
+      </w:r>
+      <w:proofErr w:type="spellStart"/>
+      <w:proofErr w:type="gramStart"/>
+      <w:r>
+        <w:rPr>
+          <w:rFonts w:ascii="Times New Roman" w:eastAsia="Times New Roman" w:hAnsi="Times New Roman" w:cs="Times New Roman"/>
+          <w:color w:val="242424"/>
+          <w:spacing w:val="-1"/>
+          <w:sz w:val="30"/>
+          <w:szCs w:val="30"/>
+        </w:rPr>
+        <w:t>response.body</w:t>
+      </w:r>
+      <w:proofErr w:type="spellEnd"/>
+      <w:proofErr w:type="gramEnd"/>
+      <w:r>
+        <w:rPr>
+          <w:rFonts w:ascii="Times New Roman" w:eastAsia="Times New Roman" w:hAnsi="Times New Roman" w:cs="Times New Roman"/>
+          <w:color w:val="242424"/>
+          <w:spacing w:val="-1"/>
+          <w:sz w:val="30"/>
+          <w:szCs w:val="30"/>
+        </w:rPr>
+        <w:t>) into a </w:t>
+      </w:r>
+      <w:r>
+        <w:rPr>
+          <w:rFonts w:ascii="Times New Roman" w:eastAsia="Times New Roman" w:hAnsi="Times New Roman" w:cs="Times New Roman"/>
+          <w:color w:val="242424"/>
+          <w:spacing w:val="-1"/>
+          <w:sz w:val="23"/>
+          <w:szCs w:val="23"/>
+          <w:shd w:val="clear" w:color="auto" w:fill="F2F2F2"/>
+        </w:rPr>
+        <w:t>List&lt;</w:t>
+      </w:r>
+      <w:proofErr w:type="spellStart"/>
+      <w:r>
+        <w:rPr>
+          <w:rFonts w:ascii="Times New Roman" w:eastAsia="Times New Roman" w:hAnsi="Times New Roman" w:cs="Times New Roman"/>
+          <w:color w:val="242424"/>
+          <w:spacing w:val="-1"/>
+          <w:sz w:val="23"/>
+          <w:szCs w:val="23"/>
+          <w:shd w:val="clear" w:color="auto" w:fill="F2F2F2"/>
+        </w:rPr>
+        <w:t>UserModel</w:t>
+      </w:r>
+      <w:proofErr w:type="spellEnd"/>
+      <w:r>
+        <w:rPr>
+          <w:rFonts w:ascii="Times New Roman" w:eastAsia="Times New Roman" w:hAnsi="Times New Roman" w:cs="Times New Roman"/>
+          <w:color w:val="242424"/>
+          <w:spacing w:val="-1"/>
+          <w:sz w:val="23"/>
+          <w:szCs w:val="23"/>
+          <w:shd w:val="clear" w:color="auto" w:fill="F2F2F2"/>
+        </w:rPr>
+        <w:t>&gt;</w:t>
+      </w:r>
+      <w:r>
+        <w:rPr>
+          <w:rFonts w:ascii="Times New Roman" w:eastAsia="Times New Roman" w:hAnsi="Times New Roman" w:cs="Times New Roman"/>
+          <w:color w:val="242424"/>
+          <w:spacing w:val="-1"/>
+          <w:sz w:val="30"/>
+          <w:szCs w:val="30"/>
+        </w:rPr>
+        <w:t> using the method </w:t>
+      </w:r>
+      <w:proofErr w:type="spellStart"/>
+      <w:r>
+        <w:rPr>
+          <w:rFonts w:ascii="Times New Roman" w:eastAsia="Times New Roman" w:hAnsi="Times New Roman" w:cs="Times New Roman"/>
+          <w:color w:val="242424"/>
+          <w:spacing w:val="-1"/>
+          <w:sz w:val="23"/>
+          <w:szCs w:val="23"/>
+          <w:shd w:val="clear" w:color="auto" w:fill="F2F2F2"/>
+        </w:rPr>
         <w:t>userModelFromJson</w:t>
       </w:r>
+      <w:proofErr w:type="spellEnd"/>
       <w:r>
         <w:rPr>
           <w:rFonts w:ascii="Times New Roman" w:eastAsia="Times New Roman" w:hAnsi="Times New Roman" w:cs="Times New Roman"/>
@@ -6564,7 +7034,7 @@
                     <pic:cNvPicPr/>
                   </pic:nvPicPr>
                   <pic:blipFill>
-                    <a:blip r:embed="rId31">
+                    <a:blip r:embed="rId28">
                       <a:extLst>
                         <a:ext uri="{28A0092B-C50C-407E-A947-70E740481C1C}">
                           <a14:useLocalDpi xmlns:a14="http://schemas.microsoft.com/office/drawing/2010/main" val="0"/>
@@ -6669,7 +7139,7 @@
                     <pic:cNvPicPr/>
                   </pic:nvPicPr>
                   <pic:blipFill>
-                    <a:blip r:embed="rId32">
+                    <a:blip r:embed="rId29">
                       <a:extLst>
                         <a:ext uri="{28A0092B-C50C-407E-A947-70E740481C1C}">
                           <a14:useLocalDpi xmlns:a14="http://schemas.microsoft.com/office/drawing/2010/main" val="0"/>
@@ -6720,18 +7190,9 @@
           <w:szCs w:val="23"/>
           <w:shd w:val="clear" w:color="auto" w:fill="F2F2F2"/>
         </w:rPr>
-        <w:t>List&lt;UserModel&gt;</w:t>
-      </w:r>
-      <w:r>
-        <w:rPr>
-          <w:rFonts w:ascii="Times New Roman" w:eastAsia="Times New Roman" w:hAnsi="Times New Roman" w:cs="Times New Roman"/>
-          <w:color w:val="242424"/>
-          <w:spacing w:val="-1"/>
-          <w:sz w:val="30"/>
-          <w:szCs w:val="30"/>
-        </w:rPr>
-        <w:t> and then in the </w:t>
-      </w:r>
+        <w:t>List&lt;</w:t>
+      </w:r>
+      <w:proofErr w:type="spellStart"/>
       <w:r>
         <w:rPr>
           <w:rFonts w:ascii="Times New Roman" w:eastAsia="Times New Roman" w:hAnsi="Times New Roman" w:cs="Times New Roman"/>
@@ -6741,18 +7202,9 @@
           <w:szCs w:val="23"/>
           <w:shd w:val="clear" w:color="auto" w:fill="F2F2F2"/>
         </w:rPr>
-        <w:t>initState</w:t>
-      </w:r>
-      <w:r>
-        <w:rPr>
-          <w:rFonts w:ascii="Times New Roman" w:eastAsia="Times New Roman" w:hAnsi="Times New Roman" w:cs="Times New Roman"/>
-          <w:color w:val="242424"/>
-          <w:spacing w:val="-1"/>
-          <w:sz w:val="30"/>
-          <w:szCs w:val="30"/>
-        </w:rPr>
-        <w:t> we called a method to get the data from our API. In the method, I have added </w:t>
-      </w:r>
+        <w:t>UserModel</w:t>
+      </w:r>
+      <w:proofErr w:type="spellEnd"/>
       <w:r>
         <w:rPr>
           <w:rFonts w:ascii="Times New Roman" w:eastAsia="Times New Roman" w:hAnsi="Times New Roman" w:cs="Times New Roman"/>
@@ -6762,17 +7214,97 @@
           <w:szCs w:val="23"/>
           <w:shd w:val="clear" w:color="auto" w:fill="F2F2F2"/>
         </w:rPr>
+        <w:t>&gt;</w:t>
+      </w:r>
+      <w:r>
+        <w:rPr>
+          <w:rFonts w:ascii="Times New Roman" w:eastAsia="Times New Roman" w:hAnsi="Times New Roman" w:cs="Times New Roman"/>
+          <w:color w:val="242424"/>
+          <w:spacing w:val="-1"/>
+          <w:sz w:val="30"/>
+          <w:szCs w:val="30"/>
+        </w:rPr>
+        <w:t> and then in the </w:t>
+      </w:r>
+      <w:proofErr w:type="spellStart"/>
+      <w:r>
+        <w:rPr>
+          <w:rFonts w:ascii="Times New Roman" w:eastAsia="Times New Roman" w:hAnsi="Times New Roman" w:cs="Times New Roman"/>
+          <w:color w:val="242424"/>
+          <w:spacing w:val="-1"/>
+          <w:sz w:val="23"/>
+          <w:szCs w:val="23"/>
+          <w:shd w:val="clear" w:color="auto" w:fill="F2F2F2"/>
+        </w:rPr>
+        <w:t>initState</w:t>
+      </w:r>
+      <w:proofErr w:type="spellEnd"/>
+      <w:r>
+        <w:rPr>
+          <w:rFonts w:ascii="Times New Roman" w:eastAsia="Times New Roman" w:hAnsi="Times New Roman" w:cs="Times New Roman"/>
+          <w:color w:val="242424"/>
+          <w:spacing w:val="-1"/>
+          <w:sz w:val="30"/>
+          <w:szCs w:val="30"/>
+        </w:rPr>
+        <w:t> we called a method to get the data from our API. In the method, I have added </w:t>
+      </w:r>
+      <w:proofErr w:type="spellStart"/>
+      <w:proofErr w:type="gramStart"/>
+      <w:r>
+        <w:rPr>
+          <w:rFonts w:ascii="Times New Roman" w:eastAsia="Times New Roman" w:hAnsi="Times New Roman" w:cs="Times New Roman"/>
+          <w:color w:val="242424"/>
+          <w:spacing w:val="-1"/>
+          <w:sz w:val="23"/>
+          <w:szCs w:val="23"/>
+          <w:shd w:val="clear" w:color="auto" w:fill="F2F2F2"/>
+        </w:rPr>
         <w:t>Future.delayed</w:t>
       </w:r>
-      <w:r>
-        <w:rPr>
-          <w:rFonts w:ascii="Times New Roman" w:eastAsia="Times New Roman" w:hAnsi="Times New Roman" w:cs="Times New Roman"/>
-          <w:color w:val="242424"/>
-          <w:spacing w:val="-1"/>
-          <w:sz w:val="30"/>
-          <w:szCs w:val="30"/>
-        </w:rPr>
-        <w:t> , just so that we can simulate the API time response. This API that we are using is a fake one and hence it’s pretty fast. However, real APIs aren’t that fast. So it becomes our duty to show a loader until the API response is available. Once the response is available, we rebuild the UI to show the data. Here, I have just shown a few of the data from the model class.</w:t>
+      <w:proofErr w:type="spellEnd"/>
+      <w:r>
+        <w:rPr>
+          <w:rFonts w:ascii="Times New Roman" w:eastAsia="Times New Roman" w:hAnsi="Times New Roman" w:cs="Times New Roman"/>
+          <w:color w:val="242424"/>
+          <w:spacing w:val="-1"/>
+          <w:sz w:val="30"/>
+          <w:szCs w:val="30"/>
+        </w:rPr>
+        <w:t> ,</w:t>
+      </w:r>
+      <w:proofErr w:type="gramEnd"/>
+      <w:r>
+        <w:rPr>
+          <w:rFonts w:ascii="Times New Roman" w:eastAsia="Times New Roman" w:hAnsi="Times New Roman" w:cs="Times New Roman"/>
+          <w:color w:val="242424"/>
+          <w:spacing w:val="-1"/>
+          <w:sz w:val="30"/>
+          <w:szCs w:val="30"/>
+        </w:rPr>
+        <w:t xml:space="preserve"> just so that we can simulate the API time response. This API that we are using is a fake one and hence it’s pretty fast. However, real APIs aren’t that fast. </w:t>
+      </w:r>
+      <w:proofErr w:type="gramStart"/>
+      <w:r>
+        <w:rPr>
+          <w:rFonts w:ascii="Times New Roman" w:eastAsia="Times New Roman" w:hAnsi="Times New Roman" w:cs="Times New Roman"/>
+          <w:color w:val="242424"/>
+          <w:spacing w:val="-1"/>
+          <w:sz w:val="30"/>
+          <w:szCs w:val="30"/>
+        </w:rPr>
+        <w:t>So</w:t>
+      </w:r>
+      <w:proofErr w:type="gramEnd"/>
+      <w:r>
+        <w:rPr>
+          <w:rFonts w:ascii="Times New Roman" w:eastAsia="Times New Roman" w:hAnsi="Times New Roman" w:cs="Times New Roman"/>
+          <w:color w:val="242424"/>
+          <w:spacing w:val="-1"/>
+          <w:sz w:val="30"/>
+          <w:szCs w:val="30"/>
+        </w:rPr>
+        <w:t xml:space="preserve"> it becomes our duty to show a loader until the API response is available. Once the response is available, we rebuild the UI to show the data. Here, I have just shown a few of the data from the model class.</w:t>
       </w:r>
     </w:p>
     <w:p>
@@ -6846,7 +7378,7 @@
                     <pic:cNvPicPr/>
                   </pic:nvPicPr>
                   <pic:blipFill>
-                    <a:blip r:embed="rId33">
+                    <a:blip r:embed="rId30">
                       <a:extLst>
                         <a:ext uri="{28A0092B-C50C-407E-A947-70E740481C1C}">
                           <a14:useLocalDpi xmlns:a14="http://schemas.microsoft.com/office/drawing/2010/main" val="0"/>
@@ -6979,7 +7511,7 @@
                     <pic:cNvPicPr/>
                   </pic:nvPicPr>
                   <pic:blipFill>
-                    <a:blip r:embed="rId34">
+                    <a:blip r:embed="rId31">
                       <a:extLst>
                         <a:ext uri="{28A0092B-C50C-407E-A947-70E740481C1C}">
                           <a14:useLocalDpi xmlns:a14="http://schemas.microsoft.com/office/drawing/2010/main" val="0"/>
@@ -7405,7 +7937,23 @@
           <w:sz w:val="20"/>
         </w:rPr>
         <w:lastRenderedPageBreak/>
-        <w:t xml:space="preserve">Common APIs that every APP needs nowdays </w:t>
+        <w:t xml:space="preserve">Common APIs that every APP needs </w:t>
+      </w:r>
+      <w:proofErr w:type="spellStart"/>
+      <w:r>
+        <w:rPr>
+          <w:rFonts w:ascii="Times New Roman" w:eastAsia="Times New Roman" w:hAnsi="Times New Roman" w:cs="Times New Roman"/>
+          <w:sz w:val="20"/>
+        </w:rPr>
+        <w:t>nowdays</w:t>
+      </w:r>
+      <w:proofErr w:type="spellEnd"/>
+      <w:r>
+        <w:rPr>
+          <w:rFonts w:ascii="Times New Roman" w:eastAsia="Times New Roman" w:hAnsi="Times New Roman" w:cs="Times New Roman"/>
+          <w:sz w:val="20"/>
+        </w:rPr>
+        <w:t xml:space="preserve"> </w:t>
       </w:r>
     </w:p>
     <w:p>
@@ -7469,7 +8017,7 @@
                     <pic:cNvPicPr/>
                   </pic:nvPicPr>
                   <pic:blipFill>
-                    <a:blip r:embed="rId35"/>
+                    <a:blip r:embed="rId32"/>
                     <a:stretch>
                       <a:fillRect/>
                     </a:stretch>
@@ -7540,7 +8088,7 @@
                     </pic:cNvPicPr>
                   </pic:nvPicPr>
                   <pic:blipFill>
-                    <a:blip r:embed="rId36">
+                    <a:blip r:embed="rId33">
                       <a:extLst>
                         <a:ext uri="{28A0092B-C50C-407E-A947-70E740481C1C}">
                           <a14:useLocalDpi xmlns:a14="http://schemas.microsoft.com/office/drawing/2010/main" val="0"/>
@@ -7610,7 +8158,7 @@
                     </pic:cNvPicPr>
                   </pic:nvPicPr>
                   <pic:blipFill>
-                    <a:blip r:embed="rId37">
+                    <a:blip r:embed="rId34">
                       <a:extLst>
                         <a:ext uri="{28A0092B-C50C-407E-A947-70E740481C1C}">
                           <a14:useLocalDpi xmlns:a14="http://schemas.microsoft.com/office/drawing/2010/main" val="0"/>
@@ -7696,7 +8244,23 @@
           <w:rFonts w:ascii="Times New Roman" w:eastAsia="Times New Roman" w:hAnsi="Times New Roman" w:cs="Times New Roman"/>
           <w:sz w:val="20"/>
         </w:rPr>
-        <w:t xml:space="preserve"> (Auth0 etc)</w:t>
+        <w:t xml:space="preserve"> (Auth0 </w:t>
+      </w:r>
+      <w:proofErr w:type="spellStart"/>
+      <w:r>
+        <w:rPr>
+          <w:rFonts w:ascii="Times New Roman" w:eastAsia="Times New Roman" w:hAnsi="Times New Roman" w:cs="Times New Roman"/>
+          <w:sz w:val="20"/>
+        </w:rPr>
+        <w:t>etc</w:t>
+      </w:r>
+      <w:proofErr w:type="spellEnd"/>
+      <w:r>
+        <w:rPr>
+          <w:rFonts w:ascii="Times New Roman" w:eastAsia="Times New Roman" w:hAnsi="Times New Roman" w:cs="Times New Roman"/>
+          <w:sz w:val="20"/>
+        </w:rPr>
+        <w:t>)</w:t>
       </w:r>
     </w:p>
     <w:p>
@@ -7723,14 +8287,46 @@
           <w:rFonts w:ascii="Times New Roman" w:eastAsia="Times New Roman" w:hAnsi="Times New Roman" w:cs="Times New Roman"/>
           <w:sz w:val="20"/>
         </w:rPr>
-        <w:t xml:space="preserve"> (google pay, paypal)</w:t>
-      </w:r>
-      <w:r>
-        <w:rPr>
-          <w:rFonts w:ascii="Times New Roman" w:eastAsia="Times New Roman" w:hAnsi="Times New Roman" w:cs="Times New Roman"/>
-          <w:sz w:val="20"/>
-        </w:rPr>
-        <w:t xml:space="preserve"> ( optional )</w:t>
+        <w:t xml:space="preserve"> (google pay, </w:t>
+      </w:r>
+      <w:proofErr w:type="spellStart"/>
+      <w:r>
+        <w:rPr>
+          <w:rFonts w:ascii="Times New Roman" w:eastAsia="Times New Roman" w:hAnsi="Times New Roman" w:cs="Times New Roman"/>
+          <w:sz w:val="20"/>
+        </w:rPr>
+        <w:t>paypal</w:t>
+      </w:r>
+      <w:proofErr w:type="spellEnd"/>
+      <w:r>
+        <w:rPr>
+          <w:rFonts w:ascii="Times New Roman" w:eastAsia="Times New Roman" w:hAnsi="Times New Roman" w:cs="Times New Roman"/>
+          <w:sz w:val="20"/>
+        </w:rPr>
+        <w:t>)</w:t>
+      </w:r>
+      <w:r>
+        <w:rPr>
+          <w:rFonts w:ascii="Times New Roman" w:eastAsia="Times New Roman" w:hAnsi="Times New Roman" w:cs="Times New Roman"/>
+          <w:sz w:val="20"/>
+        </w:rPr>
+        <w:t xml:space="preserve"> </w:t>
+      </w:r>
+      <w:proofErr w:type="gramStart"/>
+      <w:r>
+        <w:rPr>
+          <w:rFonts w:ascii="Times New Roman" w:eastAsia="Times New Roman" w:hAnsi="Times New Roman" w:cs="Times New Roman"/>
+          <w:sz w:val="20"/>
+        </w:rPr>
+        <w:t>( optional</w:t>
+      </w:r>
+      <w:proofErr w:type="gramEnd"/>
+      <w:r>
+        <w:rPr>
+          <w:rFonts w:ascii="Times New Roman" w:eastAsia="Times New Roman" w:hAnsi="Times New Roman" w:cs="Times New Roman"/>
+          <w:sz w:val="20"/>
+        </w:rPr>
+        <w:t xml:space="preserve"> )</w:t>
       </w:r>
     </w:p>
     <w:p>
@@ -7759,9 +8355,11 @@
         </w:rPr>
         <w:t xml:space="preserve"> (optional)</w:t>
       </w:r>
+      <w:bookmarkStart w:id="2" w:name="_GoBack"/>
+      <w:bookmarkEnd w:id="2"/>
     </w:p>
     <w:sectPr>
-      <w:headerReference w:type="default" r:id="rId38"/>
+      <w:headerReference w:type="default" r:id="rId35"/>
       <w:pgSz w:w="10620" w:h="13320"/>
       <w:pgMar w:top="740" w:right="566" w:bottom="280" w:left="708" w:header="396" w:footer="0" w:gutter="0"/>
       <w:pgNumType w:start="222"/>
@@ -7772,7 +8370,7 @@
 </file>
 
 <file path=word/endnotes.xml><?xml version="1.0" encoding="utf-8"?>
-<w:endnotes xmlns:wpc="http://schemas.microsoft.com/office/word/2010/wordprocessingCanvas" xmlns:cx="http://schemas.microsoft.com/office/drawing/2014/chartex" xmlns:cx1="http://schemas.microsoft.com/office/drawing/2015/9/8/chartex" xmlns:cx2="http://schemas.microsoft.com/office/drawing/2015/10/21/chartex" xmlns:cx3="http://schemas.microsoft.com/office/drawing/2016/5/9/chartex" xmlns:cx4="http://schemas.microsoft.com/office/drawing/2016/5/10/chartex" xmlns:cx5="http://schemas.microsoft.com/office/drawing/2016/5/11/chartex" xmlns:cx6="http://schemas.microsoft.com/office/drawing/2016/5/12/chartex" xmlns:cx7="http://schemas.microsoft.com/office/drawing/2016/5/13/chartex" xmlns:cx8="http://schemas.microsoft.com/office/drawing/2016/5/14/chartex" xmlns:mc="http://schemas.openxmlformats.org/markup-compatibility/2006" xmlns:aink="http://schemas.microsoft.com/office/drawing/2016/ink" xmlns:am3d="http://schemas.microsoft.com/office/drawing/2017/model3d" xmlns:o="urn:schemas-microsoft-com:office:office" xmlns:oel="http://schemas.microsoft.com/office/2019/extlst" xmlns:r="http://schemas.openxmlformats.org/officeDocument/2006/relationships" xmlns:m="http://schemas.openxmlformats.org/officeDocument/2006/math" xmlns:v="urn:schemas-microsoft-com:vml" xmlns:wp14="http://schemas.microsoft.com/office/word/2010/wordprocessingDrawing" xmlns:wp="http://schemas.openxmlformats.org/drawingml/2006/wordprocessingDrawing" xmlns:w10="urn:schemas-microsoft-com:office:word" xmlns:w="http://schemas.openxmlformats.org/wordprocessingml/2006/main" xmlns:w14="http://schemas.microsoft.com/office/word/2010/wordml" xmlns:w15="http://schemas.microsoft.com/office/word/2012/wordml" xmlns:w16cex="http://schemas.microsoft.com/office/word/2018/wordml/cex" xmlns:w16cid="http://schemas.microsoft.com/office/word/2016/wordml/cid" xmlns:w16="http://schemas.microsoft.com/office/word/2018/wordml" xmlns:w16du="http://schemas.microsoft.com/office/word/2023/wordml/word16du" xmlns:w16sdtdh="http://schemas.microsoft.com/office/word/2020/wordml/sdtdatahash" xmlns:w16sdtfl="http://schemas.microsoft.com/office/word/2024/wordml/sdtformatlock" xmlns:w16se="http://schemas.microsoft.com/office/word/2015/wordml/symex" xmlns:wpg="http://schemas.microsoft.com/office/word/2010/wordprocessingGroup" xmlns:wpi="http://schemas.microsoft.com/office/word/2010/wordprocessingInk" xmlns:wne="http://schemas.microsoft.com/office/word/2006/wordml" xmlns:wps="http://schemas.microsoft.com/office/word/2010/wordprocessingShape" mc:Ignorable="w14 w15 w16se w16cid w16 w16cex w16sdtdh w16sdtfl w16du wp14">
+<w:endnotes xmlns:wpc="http://schemas.microsoft.com/office/word/2010/wordprocessingCanvas" xmlns:cx="http://schemas.microsoft.com/office/drawing/2014/chartex" xmlns:cx1="http://schemas.microsoft.com/office/drawing/2015/9/8/chartex" xmlns:cx2="http://schemas.microsoft.com/office/drawing/2015/10/21/chartex" xmlns:cx3="http://schemas.microsoft.com/office/drawing/2016/5/9/chartex" xmlns:cx4="http://schemas.microsoft.com/office/drawing/2016/5/10/chartex" xmlns:cx5="http://schemas.microsoft.com/office/drawing/2016/5/11/chartex" xmlns:cx6="http://schemas.microsoft.com/office/drawing/2016/5/12/chartex" xmlns:cx7="http://schemas.microsoft.com/office/drawing/2016/5/13/chartex" xmlns:cx8="http://schemas.microsoft.com/office/drawing/2016/5/14/chartex" xmlns:mc="http://schemas.openxmlformats.org/markup-compatibility/2006" xmlns:aink="http://schemas.microsoft.com/office/drawing/2016/ink" xmlns:am3d="http://schemas.microsoft.com/office/drawing/2017/model3d" xmlns:o="urn:schemas-microsoft-com:office:office" xmlns:r="http://schemas.openxmlformats.org/officeDocument/2006/relationships" xmlns:m="http://schemas.openxmlformats.org/officeDocument/2006/math" xmlns:v="urn:schemas-microsoft-com:vml" xmlns:wp14="http://schemas.microsoft.com/office/word/2010/wordprocessingDrawing" xmlns:wp="http://schemas.openxmlformats.org/drawingml/2006/wordprocessingDrawing" xmlns:w10="urn:schemas-microsoft-com:office:word" xmlns:w="http://schemas.openxmlformats.org/wordprocessingml/2006/main" xmlns:w14="http://schemas.microsoft.com/office/word/2010/wordml" xmlns:w15="http://schemas.microsoft.com/office/word/2012/wordml" xmlns:w16cid="http://schemas.microsoft.com/office/word/2016/wordml/cid" xmlns:w16se="http://schemas.microsoft.com/office/word/2015/wordml/symex" xmlns:wpg="http://schemas.microsoft.com/office/word/2010/wordprocessingGroup" xmlns:wpi="http://schemas.microsoft.com/office/word/2010/wordprocessingInk" xmlns:wne="http://schemas.microsoft.com/office/word/2006/wordml" xmlns:wps="http://schemas.microsoft.com/office/word/2010/wordprocessingShape" mc:Ignorable="w14 w15 w16se w16cid wp14">
   <w:endnote w:type="separator" w:id="-1">
     <w:p>
       <w:r>
@@ -7791,7 +8389,7 @@
 </file>
 
 <file path=word/footer1.xml><?xml version="1.0" encoding="utf-8"?>
-<w:ftr xmlns:wpc="http://schemas.microsoft.com/office/word/2010/wordprocessingCanvas" xmlns:cx="http://schemas.microsoft.com/office/drawing/2014/chartex" xmlns:cx1="http://schemas.microsoft.com/office/drawing/2015/9/8/chartex" xmlns:cx2="http://schemas.microsoft.com/office/drawing/2015/10/21/chartex" xmlns:cx3="http://schemas.microsoft.com/office/drawing/2016/5/9/chartex" xmlns:cx4="http://schemas.microsoft.com/office/drawing/2016/5/10/chartex" xmlns:cx5="http://schemas.microsoft.com/office/drawing/2016/5/11/chartex" xmlns:cx6="http://schemas.microsoft.com/office/drawing/2016/5/12/chartex" xmlns:cx7="http://schemas.microsoft.com/office/drawing/2016/5/13/chartex" xmlns:cx8="http://schemas.microsoft.com/office/drawing/2016/5/14/chartex" xmlns:mc="http://schemas.openxmlformats.org/markup-compatibility/2006" xmlns:aink="http://schemas.microsoft.com/office/drawing/2016/ink" xmlns:am3d="http://schemas.microsoft.com/office/drawing/2017/model3d" xmlns:o="urn:schemas-microsoft-com:office:office" xmlns:oel="http://schemas.microsoft.com/office/2019/extlst" xmlns:r="http://schemas.openxmlformats.org/officeDocument/2006/relationships" xmlns:m="http://schemas.openxmlformats.org/officeDocument/2006/math" xmlns:v="urn:schemas-microsoft-com:vml" xmlns:wp14="http://schemas.microsoft.com/office/word/2010/wordprocessingDrawing" xmlns:wp="http://schemas.openxmlformats.org/drawingml/2006/wordprocessingDrawing" xmlns:w10="urn:schemas-microsoft-com:office:word" xmlns:w="http://schemas.openxmlformats.org/wordprocessingml/2006/main" xmlns:w14="http://schemas.microsoft.com/office/word/2010/wordml" xmlns:w15="http://schemas.microsoft.com/office/word/2012/wordml" xmlns:w16cex="http://schemas.microsoft.com/office/word/2018/wordml/cex" xmlns:w16cid="http://schemas.microsoft.com/office/word/2016/wordml/cid" xmlns:w16="http://schemas.microsoft.com/office/word/2018/wordml" xmlns:w16du="http://schemas.microsoft.com/office/word/2023/wordml/word16du" xmlns:w16sdtdh="http://schemas.microsoft.com/office/word/2020/wordml/sdtdatahash" xmlns:w16sdtfl="http://schemas.microsoft.com/office/word/2024/wordml/sdtformatlock" xmlns:w16se="http://schemas.microsoft.com/office/word/2015/wordml/symex" xmlns:wpg="http://schemas.microsoft.com/office/word/2010/wordprocessingGroup" xmlns:wpi="http://schemas.microsoft.com/office/word/2010/wordprocessingInk" xmlns:wne="http://schemas.microsoft.com/office/word/2006/wordml" xmlns:wps="http://schemas.microsoft.com/office/word/2010/wordprocessingShape" mc:Ignorable="w14 w15 w16se w16cid w16 w16cex w16sdtdh w16sdtfl w16du wp14">
+<w:ftr xmlns:wpc="http://schemas.microsoft.com/office/word/2010/wordprocessingCanvas" xmlns:cx="http://schemas.microsoft.com/office/drawing/2014/chartex" xmlns:cx1="http://schemas.microsoft.com/office/drawing/2015/9/8/chartex" xmlns:cx2="http://schemas.microsoft.com/office/drawing/2015/10/21/chartex" xmlns:cx3="http://schemas.microsoft.com/office/drawing/2016/5/9/chartex" xmlns:cx4="http://schemas.microsoft.com/office/drawing/2016/5/10/chartex" xmlns:cx5="http://schemas.microsoft.com/office/drawing/2016/5/11/chartex" xmlns:cx6="http://schemas.microsoft.com/office/drawing/2016/5/12/chartex" xmlns:cx7="http://schemas.microsoft.com/office/drawing/2016/5/13/chartex" xmlns:cx8="http://schemas.microsoft.com/office/drawing/2016/5/14/chartex" xmlns:mc="http://schemas.openxmlformats.org/markup-compatibility/2006" xmlns:aink="http://schemas.microsoft.com/office/drawing/2016/ink" xmlns:am3d="http://schemas.microsoft.com/office/drawing/2017/model3d" xmlns:o="urn:schemas-microsoft-com:office:office" xmlns:r="http://schemas.openxmlformats.org/officeDocument/2006/relationships" xmlns:m="http://schemas.openxmlformats.org/officeDocument/2006/math" xmlns:v="urn:schemas-microsoft-com:vml" xmlns:wp14="http://schemas.microsoft.com/office/word/2010/wordprocessingDrawing" xmlns:wp="http://schemas.openxmlformats.org/drawingml/2006/wordprocessingDrawing" xmlns:w10="urn:schemas-microsoft-com:office:word" xmlns:w="http://schemas.openxmlformats.org/wordprocessingml/2006/main" xmlns:w14="http://schemas.microsoft.com/office/word/2010/wordml" xmlns:w15="http://schemas.microsoft.com/office/word/2012/wordml" xmlns:w16cid="http://schemas.microsoft.com/office/word/2016/wordml/cid" xmlns:w16se="http://schemas.microsoft.com/office/word/2015/wordml/symex" xmlns:wpg="http://schemas.microsoft.com/office/word/2010/wordprocessingGroup" xmlns:wpi="http://schemas.microsoft.com/office/word/2010/wordprocessingInk" xmlns:wne="http://schemas.microsoft.com/office/word/2006/wordml" xmlns:wps="http://schemas.microsoft.com/office/word/2010/wordprocessingShape" mc:Ignorable="w14 w15 w16se w16cid wp14">
   <w:p>
     <w:pPr>
       <w:pStyle w:val="BodyText"/>
@@ -7908,7 +8506,7 @@
               <v:stroke joinstyle="miter"/>
               <v:path gradientshapeok="t" o:connecttype="rect"/>
             </v:shapetype>
-            <v:shape id="Textbox 1" o:spid="_x0000_s1030" type="#_x0000_t202" style="position:absolute;margin-left:536.15pt;margin-top:818.8pt;width:12.05pt;height:12pt;z-index:-251654656;visibility:visible;mso-wrap-style:square;mso-wrap-distance-left:0;mso-wrap-distance-top:0;mso-wrap-distance-right:0;mso-wrap-distance-bottom:0;mso-position-horizontal:absolute;mso-position-horizontal-relative:page;mso-position-vertical:absolute;mso-position-vertical-relative:page;v-text-anchor:top" o:gfxdata="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" filled="f" stroked="f">
+            <v:shape id="Textbox 1" o:spid="_x0000_s1030" type="#_x0000_t202" style="position:absolute;margin-left:536.15pt;margin-top:818.8pt;width:12.05pt;height:12pt;z-index:-251654656;visibility:visible;mso-wrap-style:square;mso-wrap-distance-left:0;mso-wrap-distance-top:0;mso-wrap-distance-right:0;mso-wrap-distance-bottom:0;mso-position-horizontal:absolute;mso-position-horizontal-relative:page;mso-position-vertical:absolute;mso-position-vertical-relative:page;v-text-anchor:top" o:gfxdata="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" filled="f" stroked="f">
               <v:textbox inset="0,0,0,0">
                 <w:txbxContent>
                   <w:p>
@@ -7975,7 +8573,7 @@
 </file>
 
 <file path=word/footnotes.xml><?xml version="1.0" encoding="utf-8"?>
-<w:footnotes xmlns:wpc="http://schemas.microsoft.com/office/word/2010/wordprocessingCanvas" xmlns:cx="http://schemas.microsoft.com/office/drawing/2014/chartex" xmlns:cx1="http://schemas.microsoft.com/office/drawing/2015/9/8/chartex" xmlns:cx2="http://schemas.microsoft.com/office/drawing/2015/10/21/chartex" xmlns:cx3="http://schemas.microsoft.com/office/drawing/2016/5/9/chartex" xmlns:cx4="http://schemas.microsoft.com/office/drawing/2016/5/10/chartex" xmlns:cx5="http://schemas.microsoft.com/office/drawing/2016/5/11/chartex" xmlns:cx6="http://schemas.microsoft.com/office/drawing/2016/5/12/chartex" xmlns:cx7="http://schemas.microsoft.com/office/drawing/2016/5/13/chartex" xmlns:cx8="http://schemas.microsoft.com/office/drawing/2016/5/14/chartex" xmlns:mc="http://schemas.openxmlformats.org/markup-compatibility/2006" xmlns:aink="http://schemas.microsoft.com/office/drawing/2016/ink" xmlns:am3d="http://schemas.microsoft.com/office/drawing/2017/model3d" xmlns:o="urn:schemas-microsoft-com:office:office" xmlns:oel="http://schemas.microsoft.com/office/2019/extlst" xmlns:r="http://schemas.openxmlformats.org/officeDocument/2006/relationships" xmlns:m="http://schemas.openxmlformats.org/officeDocument/2006/math" xmlns:v="urn:schemas-microsoft-com:vml" xmlns:wp14="http://schemas.microsoft.com/office/word/2010/wordprocessingDrawing" xmlns:wp="http://schemas.openxmlformats.org/drawingml/2006/wordprocessingDrawing" xmlns:w10="urn:schemas-microsoft-com:office:word" xmlns:w="http://schemas.openxmlformats.org/wordprocessingml/2006/main" xmlns:w14="http://schemas.microsoft.com/office/word/2010/wordml" xmlns:w15="http://schemas.microsoft.com/office/word/2012/wordml" xmlns:w16cex="http://schemas.microsoft.com/office/word/2018/wordml/cex" xmlns:w16cid="http://schemas.microsoft.com/office/word/2016/wordml/cid" xmlns:w16="http://schemas.microsoft.com/office/word/2018/wordml" xmlns:w16du="http://schemas.microsoft.com/office/word/2023/wordml/word16du" xmlns:w16sdtdh="http://schemas.microsoft.com/office/word/2020/wordml/sdtdatahash" xmlns:w16sdtfl="http://schemas.microsoft.com/office/word/2024/wordml/sdtformatlock" xmlns:w16se="http://schemas.microsoft.com/office/word/2015/wordml/symex" xmlns:wpg="http://schemas.microsoft.com/office/word/2010/wordprocessingGroup" xmlns:wpi="http://schemas.microsoft.com/office/word/2010/wordprocessingInk" xmlns:wne="http://schemas.microsoft.com/office/word/2006/wordml" xmlns:wps="http://schemas.microsoft.com/office/word/2010/wordprocessingShape" mc:Ignorable="w14 w15 w16se w16cid w16 w16cex w16sdtdh w16sdtfl w16du wp14">
+<w:footnotes xmlns:wpc="http://schemas.microsoft.com/office/word/2010/wordprocessingCanvas" xmlns:cx="http://schemas.microsoft.com/office/drawing/2014/chartex" xmlns:cx1="http://schemas.microsoft.com/office/drawing/2015/9/8/chartex" xmlns:cx2="http://schemas.microsoft.com/office/drawing/2015/10/21/chartex" xmlns:cx3="http://schemas.microsoft.com/office/drawing/2016/5/9/chartex" xmlns:cx4="http://schemas.microsoft.com/office/drawing/2016/5/10/chartex" xmlns:cx5="http://schemas.microsoft.com/office/drawing/2016/5/11/chartex" xmlns:cx6="http://schemas.microsoft.com/office/drawing/2016/5/12/chartex" xmlns:cx7="http://schemas.microsoft.com/office/drawing/2016/5/13/chartex" xmlns:cx8="http://schemas.microsoft.com/office/drawing/2016/5/14/chartex" xmlns:mc="http://schemas.openxmlformats.org/markup-compatibility/2006" xmlns:aink="http://schemas.microsoft.com/office/drawing/2016/ink" xmlns:am3d="http://schemas.microsoft.com/office/drawing/2017/model3d" xmlns:o="urn:schemas-microsoft-com:office:office" xmlns:r="http://schemas.openxmlformats.org/officeDocument/2006/relationships" xmlns:m="http://schemas.openxmlformats.org/officeDocument/2006/math" xmlns:v="urn:schemas-microsoft-com:vml" xmlns:wp14="http://schemas.microsoft.com/office/word/2010/wordprocessingDrawing" xmlns:wp="http://schemas.openxmlformats.org/drawingml/2006/wordprocessingDrawing" xmlns:w10="urn:schemas-microsoft-com:office:word" xmlns:w="http://schemas.openxmlformats.org/wordprocessingml/2006/main" xmlns:w14="http://schemas.microsoft.com/office/word/2010/wordml" xmlns:w15="http://schemas.microsoft.com/office/word/2012/wordml" xmlns:w16cid="http://schemas.microsoft.com/office/word/2016/wordml/cid" xmlns:w16se="http://schemas.microsoft.com/office/word/2015/wordml/symex" xmlns:wpg="http://schemas.microsoft.com/office/word/2010/wordprocessingGroup" xmlns:wpi="http://schemas.microsoft.com/office/word/2010/wordprocessingInk" xmlns:wne="http://schemas.microsoft.com/office/word/2006/wordml" xmlns:wps="http://schemas.microsoft.com/office/word/2010/wordprocessingShape" mc:Ignorable="w14 w15 w16se w16cid wp14">
   <w:footnote w:type="separator" w:id="-1">
     <w:p>
       <w:r>
@@ -7994,7 +8592,7 @@
 </file>
 
 <file path=word/header1.xml><?xml version="1.0" encoding="utf-8"?>
-<w:hdr xmlns:wpc="http://schemas.microsoft.com/office/word/2010/wordprocessingCanvas" xmlns:cx="http://schemas.microsoft.com/office/drawing/2014/chartex" xmlns:cx1="http://schemas.microsoft.com/office/drawing/2015/9/8/chartex" xmlns:cx2="http://schemas.microsoft.com/office/drawing/2015/10/21/chartex" xmlns:cx3="http://schemas.microsoft.com/office/drawing/2016/5/9/chartex" xmlns:cx4="http://schemas.microsoft.com/office/drawing/2016/5/10/chartex" xmlns:cx5="http://schemas.microsoft.com/office/drawing/2016/5/11/chartex" xmlns:cx6="http://schemas.microsoft.com/office/drawing/2016/5/12/chartex" xmlns:cx7="http://schemas.microsoft.com/office/drawing/2016/5/13/chartex" xmlns:cx8="http://schemas.microsoft.com/office/drawing/2016/5/14/chartex" xmlns:mc="http://schemas.openxmlformats.org/markup-compatibility/2006" xmlns:aink="http://schemas.microsoft.com/office/drawing/2016/ink" xmlns:am3d="http://schemas.microsoft.com/office/drawing/2017/model3d" xmlns:o="urn:schemas-microsoft-com:office:office" xmlns:oel="http://schemas.microsoft.com/office/2019/extlst" xmlns:r="http://schemas.openxmlformats.org/officeDocument/2006/relationships" xmlns:m="http://schemas.openxmlformats.org/officeDocument/2006/math" xmlns:v="urn:schemas-microsoft-com:vml" xmlns:wp14="http://schemas.microsoft.com/office/word/2010/wordprocessingDrawing" xmlns:wp="http://schemas.openxmlformats.org/drawingml/2006/wordprocessingDrawing" xmlns:w10="urn:schemas-microsoft-com:office:word" xmlns:w="http://schemas.openxmlformats.org/wordprocessingml/2006/main" xmlns:w14="http://schemas.microsoft.com/office/word/2010/wordml" xmlns:w15="http://schemas.microsoft.com/office/word/2012/wordml" xmlns:w16cex="http://schemas.microsoft.com/office/word/2018/wordml/cex" xmlns:w16cid="http://schemas.microsoft.com/office/word/2016/wordml/cid" xmlns:w16="http://schemas.microsoft.com/office/word/2018/wordml" xmlns:w16du="http://schemas.microsoft.com/office/word/2023/wordml/word16du" xmlns:w16sdtdh="http://schemas.microsoft.com/office/word/2020/wordml/sdtdatahash" xmlns:w16sdtfl="http://schemas.microsoft.com/office/word/2024/wordml/sdtformatlock" xmlns:w16se="http://schemas.microsoft.com/office/word/2015/wordml/symex" xmlns:wpg="http://schemas.microsoft.com/office/word/2010/wordprocessingGroup" xmlns:wpi="http://schemas.microsoft.com/office/word/2010/wordprocessingInk" xmlns:wne="http://schemas.microsoft.com/office/word/2006/wordml" xmlns:wps="http://schemas.microsoft.com/office/word/2010/wordprocessingShape" mc:Ignorable="w14 w15 w16se w16cid w16 w16cex w16sdtdh w16sdtfl w16du wp14">
+<w:hdr xmlns:wpc="http://schemas.microsoft.com/office/word/2010/wordprocessingCanvas" xmlns:cx="http://schemas.microsoft.com/office/drawing/2014/chartex" xmlns:cx1="http://schemas.microsoft.com/office/drawing/2015/9/8/chartex" xmlns:cx2="http://schemas.microsoft.com/office/drawing/2015/10/21/chartex" xmlns:cx3="http://schemas.microsoft.com/office/drawing/2016/5/9/chartex" xmlns:cx4="http://schemas.microsoft.com/office/drawing/2016/5/10/chartex" xmlns:cx5="http://schemas.microsoft.com/office/drawing/2016/5/11/chartex" xmlns:cx6="http://schemas.microsoft.com/office/drawing/2016/5/12/chartex" xmlns:cx7="http://schemas.microsoft.com/office/drawing/2016/5/13/chartex" xmlns:cx8="http://schemas.microsoft.com/office/drawing/2016/5/14/chartex" xmlns:mc="http://schemas.openxmlformats.org/markup-compatibility/2006" xmlns:aink="http://schemas.microsoft.com/office/drawing/2016/ink" xmlns:am3d="http://schemas.microsoft.com/office/drawing/2017/model3d" xmlns:o="urn:schemas-microsoft-com:office:office" xmlns:r="http://schemas.openxmlformats.org/officeDocument/2006/relationships" xmlns:m="http://schemas.openxmlformats.org/officeDocument/2006/math" xmlns:v="urn:schemas-microsoft-com:vml" xmlns:wp14="http://schemas.microsoft.com/office/word/2010/wordprocessingDrawing" xmlns:wp="http://schemas.openxmlformats.org/drawingml/2006/wordprocessingDrawing" xmlns:w10="urn:schemas-microsoft-com:office:word" xmlns:w="http://schemas.openxmlformats.org/wordprocessingml/2006/main" xmlns:w14="http://schemas.microsoft.com/office/word/2010/wordml" xmlns:w15="http://schemas.microsoft.com/office/word/2012/wordml" xmlns:w16cid="http://schemas.microsoft.com/office/word/2016/wordml/cid" xmlns:w16se="http://schemas.microsoft.com/office/word/2015/wordml/symex" xmlns:wpg="http://schemas.microsoft.com/office/word/2010/wordprocessingGroup" xmlns:wpi="http://schemas.microsoft.com/office/word/2010/wordprocessingInk" xmlns:wne="http://schemas.microsoft.com/office/word/2006/wordml" xmlns:wps="http://schemas.microsoft.com/office/word/2010/wordprocessingShape" mc:Ignorable="w14 w15 w16se w16cid wp14">
   <w:p>
     <w:pPr>
       <w:pStyle w:val="Header"/>
@@ -8019,7 +8617,7 @@
 </file>
 
 <file path=word/header2.xml><?xml version="1.0" encoding="utf-8"?>
-<w:hdr xmlns:wpc="http://schemas.microsoft.com/office/word/2010/wordprocessingCanvas" xmlns:cx="http://schemas.microsoft.com/office/drawing/2014/chartex" xmlns:cx1="http://schemas.microsoft.com/office/drawing/2015/9/8/chartex" xmlns:cx2="http://schemas.microsoft.com/office/drawing/2015/10/21/chartex" xmlns:cx3="http://schemas.microsoft.com/office/drawing/2016/5/9/chartex" xmlns:cx4="http://schemas.microsoft.com/office/drawing/2016/5/10/chartex" xmlns:cx5="http://schemas.microsoft.com/office/drawing/2016/5/11/chartex" xmlns:cx6="http://schemas.microsoft.com/office/drawing/2016/5/12/chartex" xmlns:cx7="http://schemas.microsoft.com/office/drawing/2016/5/13/chartex" xmlns:cx8="http://schemas.microsoft.com/office/drawing/2016/5/14/chartex" xmlns:mc="http://schemas.openxmlformats.org/markup-compatibility/2006" xmlns:aink="http://schemas.microsoft.com/office/drawing/2016/ink" xmlns:am3d="http://schemas.microsoft.com/office/drawing/2017/model3d" xmlns:o="urn:schemas-microsoft-com:office:office" xmlns:oel="http://schemas.microsoft.com/office/2019/extlst" xmlns:r="http://schemas.openxmlformats.org/officeDocument/2006/relationships" xmlns:m="http://schemas.openxmlformats.org/officeDocument/2006/math" xmlns:v="urn:schemas-microsoft-com:vml" xmlns:wp14="http://schemas.microsoft.com/office/word/2010/wordprocessingDrawing" xmlns:wp="http://schemas.openxmlformats.org/drawingml/2006/wordprocessingDrawing" xmlns:w10="urn:schemas-microsoft-com:office:word" xmlns:w="http://schemas.openxmlformats.org/wordprocessingml/2006/main" xmlns:w14="http://schemas.microsoft.com/office/word/2010/wordml" xmlns:w15="http://schemas.microsoft.com/office/word/2012/wordml" xmlns:w16cex="http://schemas.microsoft.com/office/word/2018/wordml/cex" xmlns:w16cid="http://schemas.microsoft.com/office/word/2016/wordml/cid" xmlns:w16="http://schemas.microsoft.com/office/word/2018/wordml" xmlns:w16du="http://schemas.microsoft.com/office/word/2023/wordml/word16du" xmlns:w16sdtdh="http://schemas.microsoft.com/office/word/2020/wordml/sdtdatahash" xmlns:w16sdtfl="http://schemas.microsoft.com/office/word/2024/wordml/sdtformatlock" xmlns:w16se="http://schemas.microsoft.com/office/word/2015/wordml/symex" xmlns:wpg="http://schemas.microsoft.com/office/word/2010/wordprocessingGroup" xmlns:wpi="http://schemas.microsoft.com/office/word/2010/wordprocessingInk" xmlns:wne="http://schemas.microsoft.com/office/word/2006/wordml" xmlns:wps="http://schemas.microsoft.com/office/word/2010/wordprocessingShape" mc:Ignorable="w14 w15 w16se w16cid w16 w16cex w16sdtdh w16sdtfl w16du wp14">
+<w:hdr xmlns:wpc="http://schemas.microsoft.com/office/word/2010/wordprocessingCanvas" xmlns:cx="http://schemas.microsoft.com/office/drawing/2014/chartex" xmlns:cx1="http://schemas.microsoft.com/office/drawing/2015/9/8/chartex" xmlns:cx2="http://schemas.microsoft.com/office/drawing/2015/10/21/chartex" xmlns:cx3="http://schemas.microsoft.com/office/drawing/2016/5/9/chartex" xmlns:cx4="http://schemas.microsoft.com/office/drawing/2016/5/10/chartex" xmlns:cx5="http://schemas.microsoft.com/office/drawing/2016/5/11/chartex" xmlns:cx6="http://schemas.microsoft.com/office/drawing/2016/5/12/chartex" xmlns:cx7="http://schemas.microsoft.com/office/drawing/2016/5/13/chartex" xmlns:cx8="http://schemas.microsoft.com/office/drawing/2016/5/14/chartex" xmlns:mc="http://schemas.openxmlformats.org/markup-compatibility/2006" xmlns:aink="http://schemas.microsoft.com/office/drawing/2016/ink" xmlns:am3d="http://schemas.microsoft.com/office/drawing/2017/model3d" xmlns:o="urn:schemas-microsoft-com:office:office" xmlns:r="http://schemas.openxmlformats.org/officeDocument/2006/relationships" xmlns:m="http://schemas.openxmlformats.org/officeDocument/2006/math" xmlns:v="urn:schemas-microsoft-com:vml" xmlns:wp14="http://schemas.microsoft.com/office/word/2010/wordprocessingDrawing" xmlns:wp="http://schemas.openxmlformats.org/drawingml/2006/wordprocessingDrawing" xmlns:w10="urn:schemas-microsoft-com:office:word" xmlns:w="http://schemas.openxmlformats.org/wordprocessingml/2006/main" xmlns:w14="http://schemas.microsoft.com/office/word/2010/wordml" xmlns:w15="http://schemas.microsoft.com/office/word/2012/wordml" xmlns:w16cid="http://schemas.microsoft.com/office/word/2016/wordml/cid" xmlns:w16se="http://schemas.microsoft.com/office/word/2015/wordml/symex" xmlns:wpg="http://schemas.microsoft.com/office/word/2010/wordprocessingGroup" xmlns:wpi="http://schemas.microsoft.com/office/word/2010/wordprocessingInk" xmlns:wne="http://schemas.microsoft.com/office/word/2006/wordml" xmlns:wps="http://schemas.microsoft.com/office/word/2010/wordprocessingShape" mc:Ignorable="w14 w15 w16se w16cid wp14">
   <w:p>
     <w:pPr>
       <w:pStyle w:val="Header"/>
@@ -8288,7 +8886,7 @@
         </mc:Choice>
         <mc:Fallback>
           <w:pict>
-            <v:group w14:anchorId="7E42AA21" id="Group 74" o:spid="_x0000_s1026" style="width:530.15pt;height:31.45pt;mso-position-horizontal-relative:char;mso-position-vertical-relative:line" coordsize="57511,3994" o:gfxdata="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">
+            <v:group w14:anchorId="7E42AA21" id="Group 74" o:spid="_x0000_s1026" style="width:530.15pt;height:31.45pt;mso-position-horizontal-relative:char;mso-position-vertical-relative:line" coordsize="57511,3994" o:gfxdata="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">
               <v:shape id="Graphic 3" o:spid="_x0000_s1027" style="position:absolute;width:57511;height:3994;visibility:visible;mso-wrap-style:square;v-text-anchor:top" coordsize="5751195,399415" o:gfxdata="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" path="m5022469,371856l,371856r,27432l5022469,399288r,-27432xem5049977,r-27432,l5022545,45720r27432,l5049977,xem5751017,371856r-701040,l5049977,45732r-27432,l5022545,371856r,27432l5049977,399288r701040,l5751017,371856xe" fillcolor="gray" stroked="f">
                 <v:path arrowok="t"/>
               </v:shape>
@@ -8410,7 +9008,7 @@
 </file>
 
 <file path=word/header3.xml><?xml version="1.0" encoding="utf-8"?>
-<w:hdr xmlns:wpc="http://schemas.microsoft.com/office/word/2010/wordprocessingCanvas" xmlns:cx="http://schemas.microsoft.com/office/drawing/2014/chartex" xmlns:cx1="http://schemas.microsoft.com/office/drawing/2015/9/8/chartex" xmlns:cx2="http://schemas.microsoft.com/office/drawing/2015/10/21/chartex" xmlns:cx3="http://schemas.microsoft.com/office/drawing/2016/5/9/chartex" xmlns:cx4="http://schemas.microsoft.com/office/drawing/2016/5/10/chartex" xmlns:cx5="http://schemas.microsoft.com/office/drawing/2016/5/11/chartex" xmlns:cx6="http://schemas.microsoft.com/office/drawing/2016/5/12/chartex" xmlns:cx7="http://schemas.microsoft.com/office/drawing/2016/5/13/chartex" xmlns:cx8="http://schemas.microsoft.com/office/drawing/2016/5/14/chartex" xmlns:mc="http://schemas.openxmlformats.org/markup-compatibility/2006" xmlns:aink="http://schemas.microsoft.com/office/drawing/2016/ink" xmlns:am3d="http://schemas.microsoft.com/office/drawing/2017/model3d" xmlns:o="urn:schemas-microsoft-com:office:office" xmlns:oel="http://schemas.microsoft.com/office/2019/extlst" xmlns:r="http://schemas.openxmlformats.org/officeDocument/2006/relationships" xmlns:m="http://schemas.openxmlformats.org/officeDocument/2006/math" xmlns:v="urn:schemas-microsoft-com:vml" xmlns:wp14="http://schemas.microsoft.com/office/word/2010/wordprocessingDrawing" xmlns:wp="http://schemas.openxmlformats.org/drawingml/2006/wordprocessingDrawing" xmlns:w10="urn:schemas-microsoft-com:office:word" xmlns:w="http://schemas.openxmlformats.org/wordprocessingml/2006/main" xmlns:w14="http://schemas.microsoft.com/office/word/2010/wordml" xmlns:w15="http://schemas.microsoft.com/office/word/2012/wordml" xmlns:w16cex="http://schemas.microsoft.com/office/word/2018/wordml/cex" xmlns:w16cid="http://schemas.microsoft.com/office/word/2016/wordml/cid" xmlns:w16="http://schemas.microsoft.com/office/word/2018/wordml" xmlns:w16du="http://schemas.microsoft.com/office/word/2023/wordml/word16du" xmlns:w16sdtdh="http://schemas.microsoft.com/office/word/2020/wordml/sdtdatahash" xmlns:w16sdtfl="http://schemas.microsoft.com/office/word/2024/wordml/sdtformatlock" xmlns:w16se="http://schemas.microsoft.com/office/word/2015/wordml/symex" xmlns:wpg="http://schemas.microsoft.com/office/word/2010/wordprocessingGroup" xmlns:wpi="http://schemas.microsoft.com/office/word/2010/wordprocessingInk" xmlns:wne="http://schemas.microsoft.com/office/word/2006/wordml" xmlns:wps="http://schemas.microsoft.com/office/word/2010/wordprocessingShape" mc:Ignorable="w14 w15 w16se w16cid w16 w16cex w16sdtdh w16sdtfl w16du wp14">
+<w:hdr xmlns:wpc="http://schemas.microsoft.com/office/word/2010/wordprocessingCanvas" xmlns:cx="http://schemas.microsoft.com/office/drawing/2014/chartex" xmlns:cx1="http://schemas.microsoft.com/office/drawing/2015/9/8/chartex" xmlns:cx2="http://schemas.microsoft.com/office/drawing/2015/10/21/chartex" xmlns:cx3="http://schemas.microsoft.com/office/drawing/2016/5/9/chartex" xmlns:cx4="http://schemas.microsoft.com/office/drawing/2016/5/10/chartex" xmlns:cx5="http://schemas.microsoft.com/office/drawing/2016/5/11/chartex" xmlns:cx6="http://schemas.microsoft.com/office/drawing/2016/5/12/chartex" xmlns:cx7="http://schemas.microsoft.com/office/drawing/2016/5/13/chartex" xmlns:cx8="http://schemas.microsoft.com/office/drawing/2016/5/14/chartex" xmlns:mc="http://schemas.openxmlformats.org/markup-compatibility/2006" xmlns:aink="http://schemas.microsoft.com/office/drawing/2016/ink" xmlns:am3d="http://schemas.microsoft.com/office/drawing/2017/model3d" xmlns:o="urn:schemas-microsoft-com:office:office" xmlns:r="http://schemas.openxmlformats.org/officeDocument/2006/relationships" xmlns:m="http://schemas.openxmlformats.org/officeDocument/2006/math" xmlns:v="urn:schemas-microsoft-com:vml" xmlns:wp14="http://schemas.microsoft.com/office/word/2010/wordprocessingDrawing" xmlns:wp="http://schemas.openxmlformats.org/drawingml/2006/wordprocessingDrawing" xmlns:w10="urn:schemas-microsoft-com:office:word" xmlns:w="http://schemas.openxmlformats.org/wordprocessingml/2006/main" xmlns:w14="http://schemas.microsoft.com/office/word/2010/wordml" xmlns:w15="http://schemas.microsoft.com/office/word/2012/wordml" xmlns:w16cid="http://schemas.microsoft.com/office/word/2016/wordml/cid" xmlns:w16se="http://schemas.microsoft.com/office/word/2015/wordml/symex" xmlns:wpg="http://schemas.microsoft.com/office/word/2010/wordprocessingGroup" xmlns:wpi="http://schemas.microsoft.com/office/word/2010/wordprocessingInk" xmlns:wne="http://schemas.microsoft.com/office/word/2006/wordml" xmlns:wps="http://schemas.microsoft.com/office/word/2010/wordprocessingShape" mc:Ignorable="w14 w15 w16se w16cid wp14">
   <w:p>
     <w:pPr>
       <w:pStyle w:val="Header"/>
@@ -8420,7 +9018,7 @@
 </file>
 
 <file path=word/numbering.xml><?xml version="1.0" encoding="utf-8"?>
-<w:numbering xmlns:wpc="http://schemas.microsoft.com/office/word/2010/wordprocessingCanvas" xmlns:cx="http://schemas.microsoft.com/office/drawing/2014/chartex" xmlns:cx1="http://schemas.microsoft.com/office/drawing/2015/9/8/chartex" xmlns:cx2="http://schemas.microsoft.com/office/drawing/2015/10/21/chartex" xmlns:cx3="http://schemas.microsoft.com/office/drawing/2016/5/9/chartex" xmlns:cx4="http://schemas.microsoft.com/office/drawing/2016/5/10/chartex" xmlns:cx5="http://schemas.microsoft.com/office/drawing/2016/5/11/chartex" xmlns:cx6="http://schemas.microsoft.com/office/drawing/2016/5/12/chartex" xmlns:cx7="http://schemas.microsoft.com/office/drawing/2016/5/13/chartex" xmlns:cx8="http://schemas.microsoft.com/office/drawing/2016/5/14/chartex" xmlns:mc="http://schemas.openxmlformats.org/markup-compatibility/2006" xmlns:aink="http://schemas.microsoft.com/office/drawing/2016/ink" xmlns:am3d="http://schemas.microsoft.com/office/drawing/2017/model3d" xmlns:o="urn:schemas-microsoft-com:office:office" xmlns:oel="http://schemas.microsoft.com/office/2019/extlst" xmlns:r="http://schemas.openxmlformats.org/officeDocument/2006/relationships" xmlns:m="http://schemas.openxmlformats.org/officeDocument/2006/math" xmlns:v="urn:schemas-microsoft-com:vml" xmlns:wp14="http://schemas.microsoft.com/office/word/2010/wordprocessingDrawing" xmlns:wp="http://schemas.openxmlformats.org/drawingml/2006/wordprocessingDrawing" xmlns:w10="urn:schemas-microsoft-com:office:word" xmlns:w="http://schemas.openxmlformats.org/wordprocessingml/2006/main" xmlns:w14="http://schemas.microsoft.com/office/word/2010/wordml" xmlns:w15="http://schemas.microsoft.com/office/word/2012/wordml" xmlns:w16cex="http://schemas.microsoft.com/office/word/2018/wordml/cex" xmlns:w16cid="http://schemas.microsoft.com/office/word/2016/wordml/cid" xmlns:w16="http://schemas.microsoft.com/office/word/2018/wordml" xmlns:w16du="http://schemas.microsoft.com/office/word/2023/wordml/word16du" xmlns:w16sdtdh="http://schemas.microsoft.com/office/word/2020/wordml/sdtdatahash" xmlns:w16sdtfl="http://schemas.microsoft.com/office/word/2024/wordml/sdtformatlock" xmlns:w16se="http://schemas.microsoft.com/office/word/2015/wordml/symex" xmlns:wpg="http://schemas.microsoft.com/office/word/2010/wordprocessingGroup" xmlns:wpi="http://schemas.microsoft.com/office/word/2010/wordprocessingInk" xmlns:wne="http://schemas.microsoft.com/office/word/2006/wordml" xmlns:wps="http://schemas.microsoft.com/office/word/2010/wordprocessingShape" mc:Ignorable="w14 w15 w16se w16cid w16 w16cex w16sdtdh w16sdtfl w16du wp14">
+<w:numbering xmlns:wpc="http://schemas.microsoft.com/office/word/2010/wordprocessingCanvas" xmlns:cx="http://schemas.microsoft.com/office/drawing/2014/chartex" xmlns:cx1="http://schemas.microsoft.com/office/drawing/2015/9/8/chartex" xmlns:cx2="http://schemas.microsoft.com/office/drawing/2015/10/21/chartex" xmlns:cx3="http://schemas.microsoft.com/office/drawing/2016/5/9/chartex" xmlns:cx4="http://schemas.microsoft.com/office/drawing/2016/5/10/chartex" xmlns:cx5="http://schemas.microsoft.com/office/drawing/2016/5/11/chartex" xmlns:cx6="http://schemas.microsoft.com/office/drawing/2016/5/12/chartex" xmlns:cx7="http://schemas.microsoft.com/office/drawing/2016/5/13/chartex" xmlns:cx8="http://schemas.microsoft.com/office/drawing/2016/5/14/chartex" xmlns:mc="http://schemas.openxmlformats.org/markup-compatibility/2006" xmlns:aink="http://schemas.microsoft.com/office/drawing/2016/ink" xmlns:am3d="http://schemas.microsoft.com/office/drawing/2017/model3d" xmlns:o="urn:schemas-microsoft-com:office:office" xmlns:r="http://schemas.openxmlformats.org/officeDocument/2006/relationships" xmlns:m="http://schemas.openxmlformats.org/officeDocument/2006/math" xmlns:v="urn:schemas-microsoft-com:vml" xmlns:wp14="http://schemas.microsoft.com/office/word/2010/wordprocessingDrawing" xmlns:wp="http://schemas.openxmlformats.org/drawingml/2006/wordprocessingDrawing" xmlns:w10="urn:schemas-microsoft-com:office:word" xmlns:w="http://schemas.openxmlformats.org/wordprocessingml/2006/main" xmlns:w14="http://schemas.microsoft.com/office/word/2010/wordml" xmlns:w15="http://schemas.microsoft.com/office/word/2012/wordml" xmlns:w16cid="http://schemas.microsoft.com/office/word/2016/wordml/cid" xmlns:w16se="http://schemas.microsoft.com/office/word/2015/wordml/symex" xmlns:wpg="http://schemas.microsoft.com/office/word/2010/wordprocessingGroup" xmlns:wpi="http://schemas.microsoft.com/office/word/2010/wordprocessingInk" xmlns:wne="http://schemas.microsoft.com/office/word/2006/wordml" xmlns:wps="http://schemas.microsoft.com/office/word/2010/wordprocessingShape" mc:Ignorable="w14 w15 w16se w16cid wp14">
   <w:abstractNum w:abstractNumId="0" w15:restartNumberingAfterBreak="0">
     <w:nsid w:val="0D064C42"/>
     <w:multiLevelType w:val="hybridMultilevel"/>
@@ -9636,41 +10234,41 @@
       </w:rPr>
     </w:lvl>
   </w:abstractNum>
-  <w:num w:numId="1" w16cid:durableId="1153327023">
+  <w:num w:numId="1">
     <w:abstractNumId w:val="8"/>
   </w:num>
-  <w:num w:numId="2" w16cid:durableId="490566540">
+  <w:num w:numId="2">
     <w:abstractNumId w:val="6"/>
   </w:num>
-  <w:num w:numId="3" w16cid:durableId="1725644491">
+  <w:num w:numId="3">
     <w:abstractNumId w:val="0"/>
   </w:num>
-  <w:num w:numId="4" w16cid:durableId="910502607">
+  <w:num w:numId="4">
     <w:abstractNumId w:val="3"/>
   </w:num>
-  <w:num w:numId="5" w16cid:durableId="592739538">
+  <w:num w:numId="5">
     <w:abstractNumId w:val="7"/>
   </w:num>
-  <w:num w:numId="6" w16cid:durableId="293563113">
+  <w:num w:numId="6">
     <w:abstractNumId w:val="1"/>
   </w:num>
-  <w:num w:numId="7" w16cid:durableId="220285702">
+  <w:num w:numId="7">
     <w:abstractNumId w:val="2"/>
   </w:num>
-  <w:num w:numId="8" w16cid:durableId="144323467">
+  <w:num w:numId="8">
     <w:abstractNumId w:val="4"/>
   </w:num>
-  <w:num w:numId="9" w16cid:durableId="1152214502">
+  <w:num w:numId="9">
     <w:abstractNumId w:val="5"/>
   </w:num>
-  <w:num w:numId="10" w16cid:durableId="192227626">
+  <w:num w:numId="10">
     <w:abstractNumId w:val="9"/>
   </w:num>
 </w:numbering>
 </file>
 
 <file path=word/styles.xml><?xml version="1.0" encoding="utf-8"?>
-<w:styles xmlns:mc="http://schemas.openxmlformats.org/markup-compatibility/2006" xmlns:r="http://schemas.openxmlformats.org/officeDocument/2006/relationships" xmlns:w="http://schemas.openxmlformats.org/wordprocessingml/2006/main" xmlns:w14="http://schemas.microsoft.com/office/word/2010/wordml" xmlns:w15="http://schemas.microsoft.com/office/word/2012/wordml" xmlns:w16cex="http://schemas.microsoft.com/office/word/2018/wordml/cex" xmlns:w16cid="http://schemas.microsoft.com/office/word/2016/wordml/cid" xmlns:w16="http://schemas.microsoft.com/office/word/2018/wordml" xmlns:w16du="http://schemas.microsoft.com/office/word/2023/wordml/word16du" xmlns:w16sdtdh="http://schemas.microsoft.com/office/word/2020/wordml/sdtdatahash" xmlns:w16sdtfl="http://schemas.microsoft.com/office/word/2024/wordml/sdtformatlock" xmlns:w16se="http://schemas.microsoft.com/office/word/2015/wordml/symex" mc:Ignorable="w14 w15 w16se w16cid w16 w16cex w16sdtdh w16sdtfl w16du">
+<w:styles xmlns:mc="http://schemas.openxmlformats.org/markup-compatibility/2006" xmlns:r="http://schemas.openxmlformats.org/officeDocument/2006/relationships" xmlns:w="http://schemas.openxmlformats.org/wordprocessingml/2006/main" xmlns:w14="http://schemas.microsoft.com/office/word/2010/wordml" xmlns:w15="http://schemas.microsoft.com/office/word/2012/wordml" xmlns:w16cid="http://schemas.microsoft.com/office/word/2016/wordml/cid" xmlns:w16se="http://schemas.microsoft.com/office/word/2015/wordml/symex" mc:Ignorable="w14 w15 w16se w16cid">
   <w:docDefaults>
     <w:rPrDefault>
       <w:rPr>
@@ -9688,7 +10286,7 @@
       </w:pPr>
     </w:pPrDefault>
   </w:docDefaults>
-  <w:latentStyles w:defLockedState="0" w:defUIPriority="99" w:defSemiHidden="0" w:defUnhideWhenUsed="0" w:defQFormat="0" w:count="376">
+  <w:latentStyles w:defLockedState="0" w:defUIPriority="99" w:defSemiHidden="0" w:defUnhideWhenUsed="0" w:defQFormat="0" w:count="375">
     <w:lsdException w:name="Normal" w:uiPriority="0" w:qFormat="1"/>
     <w:lsdException w:name="heading 1" w:uiPriority="9" w:qFormat="1"/>
     <w:lsdException w:name="heading 2" w:semiHidden="1" w:uiPriority="9" w:unhideWhenUsed="1" w:qFormat="1"/>
@@ -10064,7 +10662,6 @@
     <w:lsdException w:name="Smart Hyperlink" w:semiHidden="1" w:unhideWhenUsed="1"/>
     <w:lsdException w:name="Hashtag" w:semiHidden="1" w:unhideWhenUsed="1"/>
     <w:lsdException w:name="Unresolved Mention" w:semiHidden="1" w:unhideWhenUsed="1"/>
-    <w:lsdException w:name="Smart Link" w:semiHidden="1" w:unhideWhenUsed="1"/>
   </w:latentStyles>
   <w:style w:type="paragraph" w:default="1" w:styleId="Normal">
     <w:name w:val="Normal"/>
@@ -10595,7 +11192,7 @@
 </file>
 
 <file path=customXml/itemProps1.xml><?xml version="1.0" encoding="utf-8"?>
-<ds:datastoreItem xmlns:ds="http://schemas.openxmlformats.org/officeDocument/2006/customXml" ds:itemID="{2F665A4F-D476-4063-BFF6-572B62A96743}">
+<ds:datastoreItem xmlns:ds="http://schemas.openxmlformats.org/officeDocument/2006/customXml" ds:itemID="{6245C0BB-854D-4E5A-8204-6F12ACAA3536}">
   <ds:schemaRefs>
     <ds:schemaRef ds:uri="http://schemas.openxmlformats.org/officeDocument/2006/bibliography"/>
   </ds:schemaRefs>

</xml_diff>